<commit_message>
modificaciones para permisos, multiidioma con observer, modificacion de menu, modificaciones de gestion de usuarios
</commit_message>
<xml_diff>
--- a/Javier Morante-Ingenieria de software-VetCare.docx
+++ b/Javier Morante-Ingenieria de software-VetCare.docx
@@ -1769,91 +1769,37 @@
     </w:p>
     <w:p>
       <w:pPr>
-        <w:pStyle w:val="Estilo21"/>
-        <w:rPr>
-          <w:lang w:val="es-ES"/>
-        </w:rPr>
-      </w:pPr>
-      <w:r>
-        <w:rPr>
-          <w:lang w:val="es-ES"/>
-        </w:rPr>
-        <w:t xml:space="preserve">El propósito principal es que hoy en día no hay una herramienta que satisfaga las necesidades del cliente en cuanto a la gestión de stock </w:t>
-      </w:r>
-      <w:r>
-        <w:rPr>
-          <w:lang w:val="es-ES"/>
-        </w:rPr>
-        <w:t>de medicamentos e insumos, el seguimiento de historias clínicas de pacientes y el control de turnos.</w:t>
-      </w:r>
-    </w:p>
-    <w:p>
-      <w:pPr>
-        <w:pStyle w:val="Estilo21"/>
-        <w:rPr>
-          <w:lang w:val="es-ES"/>
-        </w:rPr>
-      </w:pPr>
-      <w:r>
-        <w:rPr>
-          <w:lang w:val="es-ES"/>
-        </w:rPr>
-        <w:t>Se espera que nuestro sistema facilite la complejidad de la carga manual de estos procesos con una interfaz amigable, sencilla de mantener.</w:t>
-      </w:r>
-    </w:p>
-    <w:p>
-      <w:pPr>
-        <w:pStyle w:val="Estilo21"/>
-        <w:rPr>
-          <w:lang w:val="es-ES"/>
-        </w:rPr>
-      </w:pPr>
-      <w:r>
-        <w:rPr>
-          <w:lang w:val="es-ES"/>
-        </w:rPr>
-        <w:t xml:space="preserve">Por ende y como objetivo general, la elección de este proyecto se basa en deprecar esas viejas </w:t>
-      </w:r>
-      <w:r>
-        <w:rPr>
-          <w:lang w:val="es-ES"/>
-        </w:rPr>
-        <w:t>prácticas</w:t>
-      </w:r>
-      <w:r>
-        <w:rPr>
-          <w:lang w:val="es-ES"/>
-        </w:rPr>
-        <w:t xml:space="preserve"> y proveer un sistema que ayude a los usuarios a manejar la administración de forma centralizada, mitigando posibles errores como la falta de stock por mala organización, y la demanda de turnos, además de las historias clínicas en papel de los clientes que suelen extraviarse y no tienen una plantilla estándar.</w:t>
-      </w:r>
-    </w:p>
-    <w:p>
-      <w:pPr>
-        <w:pStyle w:val="EstiloJavi"/>
-        <w:rPr>
-          <w:lang w:val="es-ES"/>
-        </w:rPr>
-      </w:pPr>
-    </w:p>
-    <w:p>
-      <w:pPr>
-        <w:pStyle w:val="EstiloJavi"/>
-        <w:rPr>
-          <w:lang w:val="es-ES"/>
-        </w:rPr>
-      </w:pPr>
-    </w:p>
-    <w:p/>
-    <w:p>
-      <w:pPr>
         <w:tabs>
           <w:tab w:val="left" w:pos="7181"/>
         </w:tabs>
         <w:rPr>
-          <w:rFonts w:cs="Arial"/>
-          <w:b/>
-        </w:rPr>
-      </w:pPr>
+          <w:sz w:val="22"/>
+          <w:lang w:val="es-ES"/>
+        </w:rPr>
+      </w:pPr>
+      <w:r>
+        <w:rPr>
+          <w:sz w:val="22"/>
+          <w:lang w:val="es-ES"/>
+        </w:rPr>
+        <w:t xml:space="preserve">La empresa </w:t>
+      </w:r>
+      <w:proofErr w:type="spellStart"/>
+      <w:r>
+        <w:rPr>
+          <w:sz w:val="22"/>
+          <w:lang w:val="es-ES"/>
+        </w:rPr>
+        <w:t>VetCare</w:t>
+      </w:r>
+      <w:proofErr w:type="spellEnd"/>
+      <w:r>
+        <w:rPr>
+          <w:sz w:val="22"/>
+          <w:lang w:val="es-ES"/>
+        </w:rPr>
+        <w:t xml:space="preserve"> es una organización dedicada al ramo de la atención integral de mascotas, ofreciendo servicios clínicos, vacunación, control sanitario y venta de productos veterinarios. Con una trayectoria consolidada de 10 años en el mercado, su enfoque está centrado en brindar una atención de calidad, promoviendo el bienestar animal y la prevención de enfermedades mediante controles periódicos y seguimiento personalizado. Su misión es garantizar la salud y calidad de vida de las mascotas ofreciendo una atención médica veterinaria de excelencia, mientras que su visión apunta a convertirse en un centro veterinario modelo y referente en la región, reconocido por la integración de servicios médicos y la optimización en la atención al cliente.</w:t>
+      </w:r>
     </w:p>
     <w:p>
       <w:pPr>
@@ -1861,10 +1807,41 @@
           <w:tab w:val="left" w:pos="7181"/>
         </w:tabs>
         <w:rPr>
-          <w:rFonts w:cs="Arial"/>
-          <w:b/>
-        </w:rPr>
-      </w:pPr>
+          <w:sz w:val="22"/>
+          <w:lang w:val="es-ES"/>
+        </w:rPr>
+      </w:pPr>
+      <w:r>
+        <w:rPr>
+          <w:sz w:val="22"/>
+          <w:lang w:val="es-ES"/>
+        </w:rPr>
+        <w:t xml:space="preserve">Actualmente, </w:t>
+      </w:r>
+      <w:proofErr w:type="spellStart"/>
+      <w:r>
+        <w:rPr>
+          <w:sz w:val="22"/>
+          <w:lang w:val="es-ES"/>
+        </w:rPr>
+        <w:t>VetCare</w:t>
+      </w:r>
+      <w:proofErr w:type="spellEnd"/>
+      <w:r>
+        <w:rPr>
+          <w:sz w:val="22"/>
+          <w:lang w:val="es-ES"/>
+        </w:rPr>
+        <w:t xml:space="preserve"> enfrenta dificultades relacionadas con el procesamiento de datos y el manejo de la información. La empresa carece de un sistema integrado que permita consolidar la gestión de pacientes, la administración de inventario y la programación de turnos. Esta falta de centralización genera duplicidad de registros, retrasos en la atención, pérdida de seguimiento en las historias clínicas e ineficiencias en el control de stock de medicamentos e insumos. La ausencia de un flujo de información ordenado limita la capacidad de la organización para analizar los </w:t>
+      </w:r>
+      <w:r>
+        <w:rPr>
+          <w:sz w:val="22"/>
+          <w:lang w:val="es-ES"/>
+        </w:rPr>
+        <w:lastRenderedPageBreak/>
+        <w:t>servicios brindados, proyectar la demanda en distintas épocas del año y tomar decisiones estratégicas oportunas.</w:t>
+      </w:r>
     </w:p>
     <w:p>
       <w:pPr>
@@ -1872,10 +1849,49 @@
           <w:tab w:val="left" w:pos="7181"/>
         </w:tabs>
         <w:rPr>
-          <w:rFonts w:cs="Arial"/>
-          <w:b/>
-        </w:rPr>
-      </w:pPr>
+          <w:sz w:val="22"/>
+          <w:lang w:val="es-ES"/>
+        </w:rPr>
+      </w:pPr>
+      <w:r>
+        <w:rPr>
+          <w:sz w:val="22"/>
+          <w:lang w:val="es-ES"/>
+        </w:rPr>
+        <w:t xml:space="preserve">En la primera reunión de trabajo entre </w:t>
+      </w:r>
+      <w:proofErr w:type="spellStart"/>
+      <w:r>
+        <w:rPr>
+          <w:sz w:val="22"/>
+          <w:lang w:val="es-ES"/>
+        </w:rPr>
+        <w:t>VetCare</w:t>
+      </w:r>
+      <w:proofErr w:type="spellEnd"/>
+      <w:r>
+        <w:rPr>
+          <w:sz w:val="22"/>
+          <w:lang w:val="es-ES"/>
+        </w:rPr>
+        <w:t xml:space="preserve"> y la consultora, el analista funcional aplicó un primer nivel de descomposición funcional y logró identificar tres módulos principales que conforman el objeto de análisis: Gestión de Pacientes e Historias Clínicas, Control de Stock de Medicamentos y Productos, y Administración de Turnos y Atención Médica. Estos Procesos de Negocio representan las áreas críticas a considerar en estos momentos por </w:t>
+      </w:r>
+      <w:proofErr w:type="spellStart"/>
+      <w:r>
+        <w:rPr>
+          <w:sz w:val="22"/>
+          <w:lang w:val="es-ES"/>
+        </w:rPr>
+        <w:t>VetCare</w:t>
+      </w:r>
+      <w:proofErr w:type="spellEnd"/>
+      <w:r>
+        <w:rPr>
+          <w:sz w:val="22"/>
+          <w:lang w:val="es-ES"/>
+        </w:rPr>
+        <w:t xml:space="preserve"> y constituyen la base para el desarrollo del proyecto.</w:t>
+      </w:r>
     </w:p>
     <w:p>
       <w:pPr>
@@ -1883,10 +1899,33 @@
           <w:tab w:val="left" w:pos="7181"/>
         </w:tabs>
         <w:rPr>
-          <w:rFonts w:cs="Arial"/>
-          <w:b/>
-        </w:rPr>
-      </w:pPr>
+          <w:sz w:val="22"/>
+          <w:lang w:val="es-ES"/>
+        </w:rPr>
+      </w:pPr>
+      <w:r>
+        <w:rPr>
+          <w:sz w:val="22"/>
+          <w:lang w:val="es-ES"/>
+        </w:rPr>
+        <w:t xml:space="preserve">La solución propuesta consiste en el emprendimiento de un proyecto de análisis, diseño, desarrollo e implementación de un Sistema de Información (SI) que integre de manera coherente los procesos inherentes a la atención médica, el control de inventario y la gestión operativa. Este sistema permitirá registrar operaciones en tiempo real, automatizar el control de stock de insumos veterinarios, gestionar agendas de turnos y generar reportes analíticos de atención y proyección de demanda que faciliten la toma de decisiones. El proyecto contempla el desarrollo de modelos gráficos y estructuras descriptivas que reflejan tanto la lógica de los procesos como la funcionalidad práctica del sistema, asegurando que la solución responda directamente a las necesidades planteadas por </w:t>
+      </w:r>
+      <w:proofErr w:type="spellStart"/>
+      <w:r>
+        <w:rPr>
+          <w:sz w:val="22"/>
+          <w:lang w:val="es-ES"/>
+        </w:rPr>
+        <w:t>VetCare</w:t>
+      </w:r>
+      <w:proofErr w:type="spellEnd"/>
+      <w:r>
+        <w:rPr>
+          <w:sz w:val="22"/>
+          <w:lang w:val="es-ES"/>
+        </w:rPr>
+        <w:t>.</w:t>
+      </w:r>
     </w:p>
     <w:p>
       <w:pPr>
@@ -1894,10 +1933,49 @@
           <w:tab w:val="left" w:pos="7181"/>
         </w:tabs>
         <w:rPr>
-          <w:rFonts w:cs="Arial"/>
-          <w:b/>
-        </w:rPr>
-      </w:pPr>
+          <w:sz w:val="22"/>
+          <w:lang w:val="es-ES"/>
+        </w:rPr>
+      </w:pPr>
+      <w:r>
+        <w:rPr>
+          <w:sz w:val="22"/>
+          <w:lang w:val="es-ES"/>
+        </w:rPr>
+        <w:t xml:space="preserve">La aplicación del nuevo sistema traerá mejoras significativas para </w:t>
+      </w:r>
+      <w:proofErr w:type="spellStart"/>
+      <w:r>
+        <w:rPr>
+          <w:sz w:val="22"/>
+          <w:lang w:val="es-ES"/>
+        </w:rPr>
+        <w:t>VetCare</w:t>
+      </w:r>
+      <w:proofErr w:type="spellEnd"/>
+      <w:r>
+        <w:rPr>
+          <w:sz w:val="22"/>
+          <w:lang w:val="es-ES"/>
+        </w:rPr>
+        <w:t xml:space="preserve">: optimización en el manejo de la información, reducción de errores en los registros clínicos, mayor eficiencia en la reposición de medicamentos y una visión integral de las operaciones de la clínica. Además, permitirá a la organización contar con datos confiables para la planificación estratégica, automatizar recordatorios de controles y vacunaciones para mejorar la experiencia del cliente, ofrecer una herramienta amigable de trabajo para el personal involucrado y fortalecer su posicionamiento en el sector veterinario. En definitiva, la ejecución y culminación del proyecto garantizará que </w:t>
+      </w:r>
+      <w:proofErr w:type="spellStart"/>
+      <w:r>
+        <w:rPr>
+          <w:sz w:val="22"/>
+          <w:lang w:val="es-ES"/>
+        </w:rPr>
+        <w:t>VetCare</w:t>
+      </w:r>
+      <w:proofErr w:type="spellEnd"/>
+      <w:r>
+        <w:rPr>
+          <w:sz w:val="22"/>
+          <w:lang w:val="es-ES"/>
+        </w:rPr>
+        <w:t xml:space="preserve"> transforme su problemática actual en una oportunidad de crecimiento y consolidación.</w:t>
+      </w:r>
     </w:p>
     <w:p>
       <w:pPr>
@@ -1907,6 +1985,7 @@
         <w:rPr>
           <w:rFonts w:cs="Arial"/>
           <w:b/>
+          <w:lang w:val="es-ES"/>
         </w:rPr>
       </w:pPr>
     </w:p>
@@ -1918,6 +1997,18 @@
         <w:rPr>
           <w:rFonts w:cs="Arial"/>
           <w:b/>
+          <w:lang w:val="es-ES"/>
+        </w:rPr>
+      </w:pPr>
+    </w:p>
+    <w:p>
+      <w:pPr>
+        <w:tabs>
+          <w:tab w:val="left" w:pos="7181"/>
+        </w:tabs>
+        <w:rPr>
+          <w:rFonts w:cs="Arial"/>
+          <w:b/>
         </w:rPr>
       </w:pPr>
     </w:p>
@@ -1927,6 +2018,7 @@
       </w:pPr>
       <w:bookmarkStart w:id="3" w:name="_Toc230027904"/>
       <w:r>
+        <w:lastRenderedPageBreak/>
         <w:t>G02. Descripción general del producto y alcance</w:t>
       </w:r>
       <w:bookmarkEnd w:id="3"/>
@@ -2038,59 +2130,72 @@
           <w:numId w:val="2"/>
         </w:numPr>
         <w:rPr>
+          <w:b w:val="0"/>
+          <w:bCs w:val="0"/>
           <w:highlight w:val="cyan"/>
         </w:rPr>
       </w:pPr>
       <w:r>
         <w:rPr>
-          <w:lang w:val="es-ES"/>
-        </w:rPr>
-        <w:t xml:space="preserve">El cliente se acerca al vendedor </w:t>
-      </w:r>
-      <w:r>
-        <w:rPr>
+          <w:b w:val="0"/>
+          <w:bCs w:val="0"/>
+          <w:lang w:val="es-ES"/>
+        </w:rPr>
+        <w:t xml:space="preserve">El cliente se acerca al </w:t>
+      </w:r>
+      <w:r>
+        <w:rPr>
+          <w:b w:val="0"/>
+          <w:bCs w:val="0"/>
+          <w:highlight w:val="yellow"/>
+          <w:lang w:val="es-ES"/>
+        </w:rPr>
+        <w:t>vendedor</w:t>
+      </w:r>
+      <w:r>
+        <w:rPr>
+          <w:b w:val="0"/>
+          <w:bCs w:val="0"/>
+          <w:lang w:val="es-ES"/>
+        </w:rPr>
+        <w:t xml:space="preserve"> para </w:t>
+      </w:r>
+      <w:r>
+        <w:rPr>
+          <w:b w:val="0"/>
+          <w:bCs w:val="0"/>
           <w:highlight w:val="magenta"/>
           <w:lang w:val="es-ES"/>
         </w:rPr>
-        <w:t>para consultar</w:t>
-      </w:r>
-      <w:r>
-        <w:rPr>
-          <w:lang w:val="es-ES"/>
-        </w:rPr>
-        <w:t xml:space="preserve"> sobre la atención de su mascota. </w:t>
-      </w:r>
-      <w:r>
-        <w:rPr>
-          <w:highlight w:val="magenta"/>
-          <w:lang w:val="es-ES"/>
-        </w:rPr>
-        <w:t>El vendedor le preguntará</w:t>
-      </w:r>
-      <w:r>
-        <w:rPr>
-          <w:lang w:val="es-ES"/>
-        </w:rPr>
-        <w:t xml:space="preserve"> si ya se atendió previamente para continuar sobre la historia </w:t>
-      </w:r>
-      <w:r>
-        <w:rPr>
-          <w:lang w:val="es-ES"/>
-        </w:rPr>
-        <w:lastRenderedPageBreak/>
-        <w:t>clínica anterior o crear una nueva.</w:t>
-      </w:r>
-      <w:r>
-        <w:rPr>
+        <w:t>consultar</w:t>
+      </w:r>
+      <w:r>
+        <w:rPr>
+          <w:b w:val="0"/>
+          <w:bCs w:val="0"/>
+          <w:lang w:val="es-ES"/>
+        </w:rPr>
+        <w:t xml:space="preserve"> sobre la atención de su mascota. El vendedor le preguntará si ya se atendió previamente para continuar sobre la historia clínica anterior o crear una nueva.</w:t>
+      </w:r>
+      <w:r>
+        <w:rPr>
+          <w:b w:val="0"/>
+          <w:bCs w:val="0"/>
           <w:lang w:val="es-ES"/>
         </w:rPr>
         <w:t xml:space="preserve"> </w:t>
       </w:r>
       <w:r>
+        <w:rPr>
+          <w:b w:val="0"/>
+          <w:bCs w:val="0"/>
+        </w:rPr>
         <w:t xml:space="preserve">Para eso preguntará </w:t>
       </w:r>
       <w:r>
         <w:rPr>
+          <w:b w:val="0"/>
+          <w:bCs w:val="0"/>
           <w:highlight w:val="cyan"/>
         </w:rPr>
         <w:t>tipo de documento, documento y nombre de mascota</w:t>
@@ -2104,85 +2209,212 @@
           <w:numId w:val="2"/>
         </w:numPr>
         <w:rPr>
-          <w:lang w:val="es-ES"/>
-        </w:rPr>
-      </w:pPr>
-      <w:r>
-        <w:rPr>
-          <w:lang w:val="es-ES"/>
-        </w:rPr>
-        <w:t xml:space="preserve">El vendedor </w:t>
-      </w:r>
-      <w:r>
-        <w:rPr>
+          <w:b w:val="0"/>
+          <w:bCs w:val="0"/>
+          <w:lang w:val="es-ES"/>
+        </w:rPr>
+      </w:pPr>
+      <w:r>
+        <w:rPr>
+          <w:b w:val="0"/>
+          <w:bCs w:val="0"/>
+          <w:lang w:val="es-ES"/>
+        </w:rPr>
+        <w:t xml:space="preserve">El </w:t>
+      </w:r>
+      <w:r>
+        <w:rPr>
+          <w:b w:val="0"/>
+          <w:bCs w:val="0"/>
+          <w:highlight w:val="yellow"/>
+          <w:lang w:val="es-ES"/>
+        </w:rPr>
+        <w:t>vendedor</w:t>
+      </w:r>
+      <w:r>
+        <w:rPr>
+          <w:b w:val="0"/>
+          <w:bCs w:val="0"/>
+          <w:lang w:val="es-ES"/>
+        </w:rPr>
+        <w:t xml:space="preserve"> </w:t>
+      </w:r>
+      <w:r>
+        <w:rPr>
+          <w:b w:val="0"/>
+          <w:bCs w:val="0"/>
+          <w:highlight w:val="magenta"/>
+          <w:lang w:val="es-ES"/>
+        </w:rPr>
+        <w:t>verifica</w:t>
+      </w:r>
+      <w:r>
+        <w:rPr>
+          <w:b w:val="0"/>
+          <w:bCs w:val="0"/>
+          <w:lang w:val="es-ES"/>
+        </w:rPr>
+        <w:t xml:space="preserve"> en el sistema </w:t>
+      </w:r>
+      <w:r>
+        <w:rPr>
+          <w:b w:val="0"/>
+          <w:bCs w:val="0"/>
+          <w:highlight w:val="red"/>
+          <w:lang w:val="es-ES"/>
+        </w:rPr>
+        <w:t xml:space="preserve">si </w:t>
+      </w:r>
+      <w:r>
+        <w:rPr>
+          <w:b w:val="0"/>
+          <w:bCs w:val="0"/>
+          <w:highlight w:val="red"/>
+          <w:lang w:val="es-ES"/>
+        </w:rPr>
+        <w:t xml:space="preserve">el cliente ya </w:t>
+      </w:r>
+      <w:r>
+        <w:rPr>
+          <w:b w:val="0"/>
+          <w:bCs w:val="0"/>
+          <w:highlight w:val="red"/>
+          <w:lang w:val="es-ES"/>
+        </w:rPr>
+        <w:t>está</w:t>
+      </w:r>
+      <w:r>
+        <w:rPr>
+          <w:b w:val="0"/>
+          <w:bCs w:val="0"/>
+          <w:highlight w:val="red"/>
+          <w:lang w:val="es-ES"/>
+        </w:rPr>
+        <w:t xml:space="preserve"> o no registrado</w:t>
+      </w:r>
+      <w:r>
+        <w:rPr>
+          <w:b w:val="0"/>
+          <w:bCs w:val="0"/>
+          <w:lang w:val="es-ES"/>
+        </w:rPr>
+        <w:t xml:space="preserve">. En caso de que este registrado, el vendedor </w:t>
+      </w:r>
+      <w:r>
+        <w:rPr>
+          <w:b w:val="0"/>
+          <w:bCs w:val="0"/>
+          <w:highlight w:val="magenta"/>
+          <w:lang w:val="es-ES"/>
+        </w:rPr>
+        <w:t>cargará</w:t>
+      </w:r>
+      <w:r>
+        <w:rPr>
+          <w:b w:val="0"/>
+          <w:bCs w:val="0"/>
+          <w:lang w:val="es-ES"/>
+        </w:rPr>
+        <w:t xml:space="preserve"> el </w:t>
+      </w:r>
+      <w:r>
+        <w:rPr>
+          <w:b w:val="0"/>
+          <w:bCs w:val="0"/>
+          <w:highlight w:val="darkGray"/>
+          <w:lang w:val="es-ES"/>
+        </w:rPr>
+        <w:t>pedido</w:t>
+      </w:r>
+      <w:r>
+        <w:rPr>
+          <w:b w:val="0"/>
+          <w:bCs w:val="0"/>
+          <w:lang w:val="es-ES"/>
+        </w:rPr>
+        <w:t xml:space="preserve"> solicitado por el cliente. En caso de que no</w:t>
+      </w:r>
+      <w:r>
+        <w:rPr>
+          <w:b w:val="0"/>
+          <w:bCs w:val="0"/>
+          <w:lang w:val="es-ES"/>
+        </w:rPr>
+        <w:t>,</w:t>
+      </w:r>
+      <w:r>
+        <w:rPr>
+          <w:b w:val="0"/>
+          <w:bCs w:val="0"/>
+          <w:lang w:val="es-ES"/>
+        </w:rPr>
+        <w:t xml:space="preserve"> dará de alta al </w:t>
+      </w:r>
+      <w:r>
+        <w:rPr>
+          <w:b w:val="0"/>
+          <w:bCs w:val="0"/>
+          <w:highlight w:val="darkGray"/>
+          <w:lang w:val="es-ES"/>
+        </w:rPr>
+        <w:t>cliente</w:t>
+      </w:r>
+      <w:r>
+        <w:rPr>
+          <w:b w:val="0"/>
+          <w:bCs w:val="0"/>
+          <w:lang w:val="es-ES"/>
+        </w:rPr>
+        <w:t xml:space="preserve"> </w:t>
+      </w:r>
+      <w:r>
+        <w:rPr>
+          <w:b w:val="0"/>
+          <w:bCs w:val="0"/>
+          <w:highlight w:val="cyan"/>
+          <w:lang w:val="es-ES"/>
+        </w:rPr>
+        <w:t xml:space="preserve">con nombre, apellido, </w:t>
+      </w:r>
+      <w:r>
+        <w:rPr>
+          <w:b w:val="0"/>
+          <w:bCs w:val="0"/>
+          <w:highlight w:val="cyan"/>
+          <w:lang w:val="es-ES"/>
+        </w:rPr>
+        <w:t>documento</w:t>
+      </w:r>
+      <w:r>
+        <w:rPr>
+          <w:b w:val="0"/>
+          <w:bCs w:val="0"/>
+          <w:highlight w:val="cyan"/>
+          <w:lang w:val="es-ES"/>
+        </w:rPr>
+        <w:t>, dirección, teléfono, nombre de mascota</w:t>
+      </w:r>
+      <w:r>
+        <w:rPr>
+          <w:b w:val="0"/>
+          <w:bCs w:val="0"/>
+          <w:lang w:val="es-ES"/>
+        </w:rPr>
+        <w:t xml:space="preserve">, </w:t>
+      </w:r>
+      <w:r>
+        <w:rPr>
+          <w:b w:val="0"/>
+          <w:bCs w:val="0"/>
           <w:highlight w:val="green"/>
           <w:lang w:val="es-ES"/>
         </w:rPr>
-        <w:t xml:space="preserve">verifica en el sistema si </w:t>
-      </w:r>
-      <w:r>
-        <w:rPr>
-          <w:highlight w:val="green"/>
-          <w:lang w:val="es-ES"/>
-        </w:rPr>
-        <w:t xml:space="preserve">el cliente ya </w:t>
-      </w:r>
-      <w:r>
-        <w:rPr>
-          <w:highlight w:val="green"/>
-          <w:lang w:val="es-ES"/>
-        </w:rPr>
-        <w:t>está</w:t>
-      </w:r>
-      <w:r>
-        <w:rPr>
-          <w:highlight w:val="green"/>
-          <w:lang w:val="es-ES"/>
-        </w:rPr>
-        <w:t xml:space="preserve"> o no registrado</w:t>
-      </w:r>
-      <w:r>
-        <w:rPr>
-          <w:lang w:val="es-ES"/>
-        </w:rPr>
-        <w:t xml:space="preserve">. En caso de que este registrado, el vendedor cargará el pedido solicitado por el cliente. En caso de que no dará de alta al cliente </w:t>
-      </w:r>
-      <w:r>
-        <w:rPr>
-          <w:highlight w:val="cyan"/>
-          <w:lang w:val="es-ES"/>
-        </w:rPr>
-        <w:t xml:space="preserve">con nombre, apellido, </w:t>
-      </w:r>
-      <w:r>
-        <w:rPr>
-          <w:highlight w:val="cyan"/>
-          <w:lang w:val="es-ES"/>
-        </w:rPr>
-        <w:t>documento</w:t>
-      </w:r>
-      <w:r>
-        <w:rPr>
-          <w:highlight w:val="cyan"/>
-          <w:lang w:val="es-ES"/>
-        </w:rPr>
-        <w:t>, dirección, teléfono, nombre de mascota</w:t>
-      </w:r>
-      <w:r>
-        <w:rPr>
-          <w:lang w:val="es-ES"/>
-        </w:rPr>
-        <w:t xml:space="preserve">, </w:t>
-      </w:r>
-      <w:r>
-        <w:rPr>
-          <w:highlight w:val="green"/>
-          <w:lang w:val="es-ES"/>
-        </w:rPr>
         <w:t>puede tener una o varias registradas a su nombre</w:t>
       </w:r>
       <w:r>
         <w:rPr>
+          <w:b w:val="0"/>
+          <w:bCs w:val="0"/>
           <w:lang w:val="es-ES"/>
         </w:rPr>
         <w:t>.</w:t>
@@ -2210,30 +2442,100 @@
           <w:numId w:val="3"/>
         </w:numPr>
         <w:rPr>
-          <w:lang w:val="es-ES"/>
-        </w:rPr>
-      </w:pPr>
-      <w:r>
-        <w:rPr>
-          <w:lang w:val="es-ES"/>
-        </w:rPr>
-        <w:t xml:space="preserve">El vendedor </w:t>
-      </w:r>
-      <w:r>
-        <w:rPr>
-          <w:highlight w:val="green"/>
-          <w:lang w:val="es-ES"/>
-        </w:rPr>
-        <w:t>busca si el cliente esta registrado</w:t>
-      </w:r>
-      <w:r>
-        <w:rPr>
-          <w:lang w:val="es-ES"/>
-        </w:rPr>
-        <w:t xml:space="preserve"> en la veterinaria con su mascota, debe estar registrado para poder tener historia clínica, una vez registrado mediante la gestión de pacientes, se procede a dar de alta la historia clínica en la cual se deben guardar los siguientes datos, </w:t>
-      </w:r>
-      <w:r>
-        <w:rPr>
+          <w:b w:val="0"/>
+          <w:bCs w:val="0"/>
+          <w:lang w:val="es-ES"/>
+        </w:rPr>
+      </w:pPr>
+      <w:r>
+        <w:rPr>
+          <w:b w:val="0"/>
+          <w:bCs w:val="0"/>
+          <w:lang w:val="es-ES"/>
+        </w:rPr>
+        <w:t xml:space="preserve">El </w:t>
+      </w:r>
+      <w:r>
+        <w:rPr>
+          <w:b w:val="0"/>
+          <w:bCs w:val="0"/>
+          <w:highlight w:val="yellow"/>
+          <w:lang w:val="es-ES"/>
+        </w:rPr>
+        <w:t>vendedor</w:t>
+      </w:r>
+      <w:r>
+        <w:rPr>
+          <w:b w:val="0"/>
+          <w:bCs w:val="0"/>
+          <w:lang w:val="es-ES"/>
+        </w:rPr>
+        <w:t xml:space="preserve"> </w:t>
+      </w:r>
+      <w:r>
+        <w:rPr>
+          <w:b w:val="0"/>
+          <w:bCs w:val="0"/>
+          <w:highlight w:val="magenta"/>
+          <w:lang w:val="es-ES"/>
+        </w:rPr>
+        <w:t>busca</w:t>
+      </w:r>
+      <w:r>
+        <w:rPr>
+          <w:b w:val="0"/>
+          <w:bCs w:val="0"/>
+          <w:lang w:val="es-ES"/>
+        </w:rPr>
+        <w:t xml:space="preserve"> </w:t>
+      </w:r>
+      <w:r>
+        <w:rPr>
+          <w:b w:val="0"/>
+          <w:bCs w:val="0"/>
+          <w:highlight w:val="red"/>
+          <w:lang w:val="es-ES"/>
+        </w:rPr>
+        <w:t>si el cliente esta registrado</w:t>
+      </w:r>
+      <w:r>
+        <w:rPr>
+          <w:b w:val="0"/>
+          <w:bCs w:val="0"/>
+          <w:lang w:val="es-ES"/>
+        </w:rPr>
+        <w:t xml:space="preserve"> en la veterinaria con su mascota, debe estar registrado para poder tener historia clínica, una vez registrado mediante la gestión de pacientes, se procede a dar de alta la </w:t>
+      </w:r>
+      <w:r>
+        <w:rPr>
+          <w:b w:val="0"/>
+          <w:bCs w:val="0"/>
+          <w:highlight w:val="darkGray"/>
+          <w:lang w:val="es-ES"/>
+        </w:rPr>
+        <w:t>historia clínica</w:t>
+      </w:r>
+      <w:r>
+        <w:rPr>
+          <w:b w:val="0"/>
+          <w:bCs w:val="0"/>
+          <w:lang w:val="es-ES"/>
+        </w:rPr>
+        <w:t xml:space="preserve"> en la cual se deben guardar los </w:t>
+      </w:r>
+      <w:r>
+        <w:rPr>
+          <w:b w:val="0"/>
+          <w:bCs w:val="0"/>
+          <w:lang w:val="es-ES"/>
+        </w:rPr>
+        <w:lastRenderedPageBreak/>
+        <w:t xml:space="preserve">siguientes datos, </w:t>
+      </w:r>
+      <w:r>
+        <w:rPr>
+          <w:b w:val="0"/>
+          <w:bCs w:val="0"/>
           <w:highlight w:val="cyan"/>
           <w:lang w:val="es-ES"/>
         </w:rPr>
@@ -2241,6 +2543,8 @@
       </w:r>
       <w:r>
         <w:rPr>
+          <w:b w:val="0"/>
+          <w:bCs w:val="0"/>
           <w:highlight w:val="cyan"/>
           <w:lang w:val="es-ES"/>
         </w:rPr>
@@ -2248,6 +2552,8 @@
       </w:r>
       <w:r>
         <w:rPr>
+          <w:b w:val="0"/>
+          <w:bCs w:val="0"/>
           <w:highlight w:val="cyan"/>
           <w:lang w:val="es-ES"/>
         </w:rPr>
@@ -2262,24 +2568,67 @@
           <w:numId w:val="3"/>
         </w:numPr>
         <w:rPr>
-          <w:lang w:val="es-ES"/>
-        </w:rPr>
-      </w:pPr>
-      <w:r>
-        <w:rPr>
-          <w:lang w:val="es-ES"/>
-        </w:rPr>
-        <w:t xml:space="preserve">El vendedor procede a guardar los datos de atención en la historia </w:t>
-      </w:r>
-      <w:r>
-        <w:rPr>
+          <w:b w:val="0"/>
+          <w:bCs w:val="0"/>
+          <w:highlight w:val="darkGray"/>
+          <w:lang w:val="es-ES"/>
+        </w:rPr>
+      </w:pPr>
+      <w:r>
+        <w:rPr>
+          <w:b w:val="0"/>
+          <w:bCs w:val="0"/>
+          <w:lang w:val="es-ES"/>
+        </w:rPr>
+        <w:t xml:space="preserve">El </w:t>
+      </w:r>
+      <w:r>
+        <w:rPr>
+          <w:b w:val="0"/>
+          <w:bCs w:val="0"/>
+          <w:highlight w:val="yellow"/>
+          <w:lang w:val="es-ES"/>
+        </w:rPr>
+        <w:t>vendedor</w:t>
+      </w:r>
+      <w:r>
+        <w:rPr>
+          <w:b w:val="0"/>
+          <w:bCs w:val="0"/>
+          <w:lang w:val="es-ES"/>
+        </w:rPr>
+        <w:t xml:space="preserve"> procede a </w:t>
+      </w:r>
+      <w:r>
+        <w:rPr>
+          <w:b w:val="0"/>
+          <w:bCs w:val="0"/>
+          <w:highlight w:val="magenta"/>
+          <w:lang w:val="es-ES"/>
+        </w:rPr>
+        <w:t>guardar</w:t>
+      </w:r>
+      <w:r>
+        <w:rPr>
+          <w:b w:val="0"/>
+          <w:bCs w:val="0"/>
+          <w:lang w:val="es-ES"/>
+        </w:rPr>
+        <w:t xml:space="preserve"> los datos de atención en la historia </w:t>
+      </w:r>
+      <w:r>
+        <w:rPr>
+          <w:b w:val="0"/>
+          <w:bCs w:val="0"/>
           <w:lang w:val="es-ES"/>
         </w:rPr>
         <w:t xml:space="preserve">clínica en </w:t>
       </w:r>
       <w:r>
         <w:rPr>
-          <w:highlight w:val="magenta"/>
+          <w:b w:val="0"/>
+          <w:bCs w:val="0"/>
+          <w:highlight w:val="darkGray"/>
           <w:lang w:val="es-ES"/>
         </w:rPr>
         <w:t>el registro de atención</w:t>
@@ -2378,17 +2727,57 @@
           <w:numId w:val="4"/>
         </w:numPr>
         <w:rPr>
-          <w:lang w:val="es-ES"/>
-        </w:rPr>
-      </w:pPr>
-      <w:r>
-        <w:rPr>
-          <w:lang w:val="es-ES"/>
-        </w:rPr>
-        <w:t>El vendedor debe registrar para la atención del paciente</w:t>
-      </w:r>
-      <w:r>
-        <w:rPr>
+          <w:b w:val="0"/>
+          <w:bCs w:val="0"/>
+          <w:lang w:val="es-ES"/>
+        </w:rPr>
+      </w:pPr>
+      <w:r>
+        <w:rPr>
+          <w:b w:val="0"/>
+          <w:bCs w:val="0"/>
+          <w:lang w:val="es-ES"/>
+        </w:rPr>
+        <w:t xml:space="preserve">El </w:t>
+      </w:r>
+      <w:r>
+        <w:rPr>
+          <w:b w:val="0"/>
+          <w:bCs w:val="0"/>
+          <w:highlight w:val="yellow"/>
+          <w:lang w:val="es-ES"/>
+        </w:rPr>
+        <w:t>vendedor</w:t>
+      </w:r>
+      <w:r>
+        <w:rPr>
+          <w:b w:val="0"/>
+          <w:bCs w:val="0"/>
+          <w:lang w:val="es-ES"/>
+        </w:rPr>
+        <w:t xml:space="preserve"> debe </w:t>
+      </w:r>
+      <w:r>
+        <w:rPr>
+          <w:b w:val="0"/>
+          <w:bCs w:val="0"/>
+          <w:highlight w:val="magenta"/>
+          <w:lang w:val="es-ES"/>
+        </w:rPr>
+        <w:t>registrar</w:t>
+      </w:r>
+      <w:r>
+        <w:rPr>
+          <w:b w:val="0"/>
+          <w:bCs w:val="0"/>
+          <w:lang w:val="es-ES"/>
+        </w:rPr>
+        <w:t xml:space="preserve"> para la atención del paciente</w:t>
+      </w:r>
+      <w:r>
+        <w:rPr>
+          <w:b w:val="0"/>
+          <w:bCs w:val="0"/>
           <w:highlight w:val="cyan"/>
           <w:lang w:val="es-ES"/>
         </w:rPr>
@@ -2403,24 +2792,66 @@
           <w:numId w:val="4"/>
         </w:numPr>
         <w:rPr>
-          <w:lang w:val="es-ES"/>
-        </w:rPr>
-      </w:pPr>
-      <w:r>
-        <w:rPr>
-          <w:lang w:val="es-ES"/>
-        </w:rPr>
-        <w:t xml:space="preserve">En caso de necesitar medicación el vendedor se encargará en un carrito de compras de registrar el </w:t>
-      </w:r>
-      <w:r>
-        <w:rPr>
-          <w:highlight w:val="cyan"/>
+          <w:b w:val="0"/>
+          <w:bCs w:val="0"/>
+          <w:lang w:val="es-ES"/>
+        </w:rPr>
+      </w:pPr>
+      <w:r>
+        <w:rPr>
+          <w:b w:val="0"/>
+          <w:bCs w:val="0"/>
+          <w:lang w:val="es-ES"/>
+        </w:rPr>
+        <w:t xml:space="preserve">En caso de necesitar medicación el vendedor se encargará en un </w:t>
+      </w:r>
+      <w:r>
+        <w:rPr>
+          <w:b w:val="0"/>
+          <w:bCs w:val="0"/>
+          <w:highlight w:val="darkGray"/>
+          <w:lang w:val="es-ES"/>
+        </w:rPr>
+        <w:t>carrito de compras</w:t>
+      </w:r>
+      <w:r>
+        <w:rPr>
+          <w:b w:val="0"/>
+          <w:bCs w:val="0"/>
+          <w:lang w:val="es-ES"/>
+        </w:rPr>
+        <w:t xml:space="preserve"> de </w:t>
+      </w:r>
+      <w:r>
+        <w:rPr>
+          <w:b w:val="0"/>
+          <w:bCs w:val="0"/>
+          <w:highlight w:val="magenta"/>
+          <w:lang w:val="es-ES"/>
+        </w:rPr>
+        <w:t>registrar</w:t>
+      </w:r>
+      <w:r>
+        <w:rPr>
+          <w:b w:val="0"/>
+          <w:bCs w:val="0"/>
+          <w:lang w:val="es-ES"/>
+        </w:rPr>
+        <w:t xml:space="preserve"> el </w:t>
+      </w:r>
+      <w:r>
+        <w:rPr>
+          <w:b w:val="0"/>
+          <w:bCs w:val="0"/>
+          <w:highlight w:val="darkGray"/>
           <w:lang w:val="es-ES"/>
         </w:rPr>
         <w:t>medicamento</w:t>
       </w:r>
       <w:r>
         <w:rPr>
+          <w:b w:val="0"/>
+          <w:bCs w:val="0"/>
           <w:lang w:val="es-ES"/>
         </w:rPr>
         <w:t xml:space="preserve"> otorgado al cliente para su próxima expedición.</w:t>
@@ -2434,24 +2865,49 @@
           <w:numId w:val="4"/>
         </w:numPr>
         <w:rPr>
-          <w:lang w:val="es-ES"/>
-        </w:rPr>
-      </w:pPr>
-      <w:r>
-        <w:rPr>
+          <w:b w:val="0"/>
+          <w:bCs w:val="0"/>
+          <w:lang w:val="es-ES"/>
+        </w:rPr>
+      </w:pPr>
+      <w:r>
+        <w:rPr>
+          <w:b w:val="0"/>
+          <w:bCs w:val="0"/>
           <w:lang w:val="es-ES"/>
         </w:rPr>
         <w:t xml:space="preserve">Luego de registrar la atención el vendedor </w:t>
       </w:r>
       <w:r>
         <w:rPr>
-          <w:highlight w:val="green"/>
-          <w:lang w:val="es-ES"/>
-        </w:rPr>
-        <w:t>entrega el diagnostico</w:t>
-      </w:r>
-      <w:r>
-        <w:rPr>
+          <w:b w:val="0"/>
+          <w:bCs w:val="0"/>
+          <w:highlight w:val="magenta"/>
+          <w:lang w:val="es-ES"/>
+        </w:rPr>
+        <w:t>entrega</w:t>
+      </w:r>
+      <w:r>
+        <w:rPr>
+          <w:b w:val="0"/>
+          <w:bCs w:val="0"/>
+          <w:lang w:val="es-ES"/>
+        </w:rPr>
+        <w:t xml:space="preserve"> el </w:t>
+      </w:r>
+      <w:r>
+        <w:rPr>
+          <w:b w:val="0"/>
+          <w:bCs w:val="0"/>
+          <w:highlight w:val="darkGray"/>
+          <w:lang w:val="es-ES"/>
+        </w:rPr>
+        <w:t>diagnostico</w:t>
+      </w:r>
+      <w:r>
+        <w:rPr>
+          <w:b w:val="0"/>
+          <w:bCs w:val="0"/>
           <w:lang w:val="es-ES"/>
         </w:rPr>
         <w:t xml:space="preserve"> al cliente. </w:t>
@@ -2462,7 +2918,6 @@
         <w:pStyle w:val="EstiloJavi"/>
       </w:pPr>
       <w:r>
-        <w:lastRenderedPageBreak/>
         <w:t>PN</w:t>
       </w:r>
       <w:r>
@@ -2480,42 +2935,74 @@
           <w:numId w:val="5"/>
         </w:numPr>
         <w:rPr>
-          <w:lang w:val="es-ES"/>
-        </w:rPr>
-      </w:pPr>
-      <w:r>
-        <w:rPr>
+          <w:b w:val="0"/>
+          <w:bCs w:val="0"/>
+          <w:lang w:val="es-ES"/>
+        </w:rPr>
+      </w:pPr>
+      <w:r>
+        <w:rPr>
+          <w:b w:val="0"/>
+          <w:bCs w:val="0"/>
           <w:lang w:val="es-ES"/>
         </w:rPr>
         <w:t xml:space="preserve">El </w:t>
       </w:r>
       <w:r>
         <w:rPr>
+          <w:b w:val="0"/>
+          <w:bCs w:val="0"/>
+          <w:highlight w:val="yellow"/>
           <w:lang w:val="es-ES"/>
         </w:rPr>
         <w:t>operario</w:t>
       </w:r>
       <w:r>
         <w:rPr>
+          <w:b w:val="0"/>
+          <w:bCs w:val="0"/>
           <w:lang w:val="es-ES"/>
         </w:rPr>
         <w:t xml:space="preserve"> </w:t>
       </w:r>
       <w:r>
         <w:rPr>
-          <w:highlight w:val="green"/>
-          <w:lang w:val="es-ES"/>
-        </w:rPr>
-        <w:t>registra los medicamentos</w:t>
-      </w:r>
-      <w:r>
-        <w:rPr>
+          <w:b w:val="0"/>
+          <w:bCs w:val="0"/>
+          <w:highlight w:val="magenta"/>
+          <w:lang w:val="es-ES"/>
+        </w:rPr>
+        <w:t xml:space="preserve">registra </w:t>
+      </w:r>
+      <w:r>
+        <w:rPr>
+          <w:b w:val="0"/>
+          <w:bCs w:val="0"/>
+          <w:lang w:val="es-ES"/>
+        </w:rPr>
+        <w:t xml:space="preserve">los </w:t>
+      </w:r>
+      <w:r>
+        <w:rPr>
+          <w:b w:val="0"/>
+          <w:bCs w:val="0"/>
+          <w:highlight w:val="darkGray"/>
+          <w:lang w:val="es-ES"/>
+        </w:rPr>
+        <w:t>medicamentos</w:t>
+      </w:r>
+      <w:r>
+        <w:rPr>
+          <w:b w:val="0"/>
+          <w:bCs w:val="0"/>
           <w:lang w:val="es-ES"/>
         </w:rPr>
         <w:t xml:space="preserve"> que llegan al consultorio, de los cuales se desea saber </w:t>
       </w:r>
       <w:r>
         <w:rPr>
+          <w:b w:val="0"/>
+          <w:bCs w:val="0"/>
           <w:highlight w:val="cyan"/>
           <w:lang w:val="es-ES"/>
         </w:rPr>
@@ -2530,43 +3017,74 @@
           <w:numId w:val="5"/>
         </w:numPr>
         <w:rPr>
-          <w:lang w:val="es-ES"/>
-        </w:rPr>
-      </w:pPr>
-      <w:r>
-        <w:rPr>
-          <w:lang w:val="es-ES"/>
-        </w:rPr>
-        <w:t xml:space="preserve">El operario </w:t>
-      </w:r>
-      <w:r>
-        <w:rPr>
-          <w:highlight w:val="magenta"/>
+          <w:b w:val="0"/>
+          <w:bCs w:val="0"/>
+          <w:lang w:val="es-ES"/>
+        </w:rPr>
+      </w:pPr>
+      <w:r>
+        <w:rPr>
+          <w:b w:val="0"/>
+          <w:bCs w:val="0"/>
+          <w:lang w:val="es-ES"/>
+        </w:rPr>
+        <w:t xml:space="preserve">El </w:t>
+      </w:r>
+      <w:r>
+        <w:rPr>
+          <w:b w:val="0"/>
+          <w:bCs w:val="0"/>
+          <w:highlight w:val="yellow"/>
+          <w:lang w:val="es-ES"/>
+        </w:rPr>
+        <w:t>operario</w:t>
+      </w:r>
+      <w:r>
+        <w:rPr>
+          <w:b w:val="0"/>
+          <w:bCs w:val="0"/>
+          <w:lang w:val="es-ES"/>
+        </w:rPr>
+        <w:t xml:space="preserve"> </w:t>
+      </w:r>
+      <w:r>
+        <w:rPr>
+          <w:b w:val="0"/>
+          <w:bCs w:val="0"/>
+          <w:highlight w:val="green"/>
           <w:lang w:val="es-ES"/>
         </w:rPr>
         <w:t>fija</w:t>
       </w:r>
       <w:r>
         <w:rPr>
-          <w:highlight w:val="magenta"/>
+          <w:b w:val="0"/>
+          <w:bCs w:val="0"/>
+          <w:highlight w:val="green"/>
           <w:lang w:val="es-ES"/>
         </w:rPr>
         <w:t xml:space="preserve"> precio y márgenes</w:t>
       </w:r>
       <w:r>
         <w:rPr>
+          <w:b w:val="0"/>
+          <w:bCs w:val="0"/>
           <w:lang w:val="es-ES"/>
         </w:rPr>
         <w:t xml:space="preserve">, para esto se </w:t>
       </w:r>
       <w:r>
         <w:rPr>
+          <w:b w:val="0"/>
+          <w:bCs w:val="0"/>
           <w:lang w:val="es-ES"/>
         </w:rPr>
         <w:t xml:space="preserve">puede registrar un </w:t>
       </w:r>
       <w:r>
         <w:rPr>
+          <w:b w:val="0"/>
+          <w:bCs w:val="0"/>
           <w:highlight w:val="cyan"/>
           <w:lang w:val="es-ES"/>
         </w:rPr>
@@ -2574,9 +3092,28 @@
       </w:r>
       <w:r>
         <w:rPr>
-          <w:lang w:val="es-ES"/>
-        </w:rPr>
-        <w:t>, por ejemplo 30% o editar según se desee.</w:t>
+          <w:b w:val="0"/>
+          <w:bCs w:val="0"/>
+          <w:lang w:val="es-ES"/>
+        </w:rPr>
+        <w:t xml:space="preserve">, </w:t>
+      </w:r>
+      <w:r>
+        <w:rPr>
+          <w:b w:val="0"/>
+          <w:bCs w:val="0"/>
+          <w:highlight w:val="cyan"/>
+          <w:lang w:val="es-ES"/>
+        </w:rPr>
+        <w:t>por ejemplo 30% o editar según se desee</w:t>
+      </w:r>
+      <w:r>
+        <w:rPr>
+          <w:b w:val="0"/>
+          <w:bCs w:val="0"/>
+          <w:lang w:val="es-ES"/>
+        </w:rPr>
+        <w:t>.</w:t>
       </w:r>
     </w:p>
     <w:p>
@@ -2587,30 +3124,66 @@
           <w:numId w:val="5"/>
         </w:numPr>
         <w:rPr>
-          <w:lang w:val="es-ES"/>
-        </w:rPr>
-      </w:pPr>
-      <w:r>
-        <w:rPr>
-          <w:lang w:val="es-ES"/>
-        </w:rPr>
-        <w:t xml:space="preserve">El operario </w:t>
-      </w:r>
-      <w:r>
-        <w:rPr>
-          <w:highlight w:val="green"/>
-          <w:lang w:val="es-ES"/>
-        </w:rPr>
-        <w:t>configura una alerta</w:t>
-      </w:r>
-      <w:r>
-        <w:rPr>
+          <w:b w:val="0"/>
+          <w:bCs w:val="0"/>
+          <w:lang w:val="es-ES"/>
+        </w:rPr>
+      </w:pPr>
+      <w:r>
+        <w:rPr>
+          <w:b w:val="0"/>
+          <w:bCs w:val="0"/>
+          <w:lang w:val="es-ES"/>
+        </w:rPr>
+        <w:t xml:space="preserve">El </w:t>
+      </w:r>
+      <w:r>
+        <w:rPr>
+          <w:b w:val="0"/>
+          <w:bCs w:val="0"/>
+          <w:highlight w:val="yellow"/>
+          <w:lang w:val="es-ES"/>
+        </w:rPr>
+        <w:t>operario</w:t>
+      </w:r>
+      <w:r>
+        <w:rPr>
+          <w:b w:val="0"/>
+          <w:bCs w:val="0"/>
+          <w:lang w:val="es-ES"/>
+        </w:rPr>
+        <w:t xml:space="preserve"> </w:t>
+      </w:r>
+      <w:r>
+        <w:rPr>
+          <w:b w:val="0"/>
+          <w:bCs w:val="0"/>
+          <w:highlight w:val="magenta"/>
+          <w:lang w:val="es-ES"/>
+        </w:rPr>
+        <w:t xml:space="preserve">configura </w:t>
+      </w:r>
+      <w:r>
+        <w:rPr>
+          <w:b w:val="0"/>
+          <w:bCs w:val="0"/>
+          <w:highlight w:val="cyan"/>
+          <w:lang w:val="es-ES"/>
+        </w:rPr>
+        <w:t>una alerta</w:t>
+      </w:r>
+      <w:r>
+        <w:rPr>
+          <w:b w:val="0"/>
+          <w:bCs w:val="0"/>
           <w:lang w:val="es-ES"/>
         </w:rPr>
         <w:t xml:space="preserve"> de </w:t>
       </w:r>
       <w:r>
         <w:rPr>
+          <w:b w:val="0"/>
+          <w:bCs w:val="0"/>
           <w:highlight w:val="cyan"/>
           <w:lang w:val="es-ES"/>
         </w:rPr>
@@ -2618,6 +3191,8 @@
       </w:r>
       <w:r>
         <w:rPr>
+          <w:b w:val="0"/>
+          <w:bCs w:val="0"/>
           <w:lang w:val="es-ES"/>
         </w:rPr>
         <w:t xml:space="preserve"> sugerida o edita según corresponda.</w:t>
@@ -2631,24 +3206,66 @@
           <w:numId w:val="5"/>
         </w:numPr>
         <w:rPr>
-          <w:lang w:val="es-ES"/>
-        </w:rPr>
-      </w:pPr>
-      <w:r>
-        <w:rPr>
-          <w:lang w:val="es-ES"/>
-        </w:rPr>
-        <w:t xml:space="preserve">El operario puede </w:t>
-      </w:r>
-      <w:r>
-        <w:rPr>
-          <w:highlight w:val="green"/>
-          <w:lang w:val="es-ES"/>
-        </w:rPr>
-        <w:t>extraer un reporte</w:t>
-      </w:r>
-      <w:r>
-        <w:rPr>
+          <w:b w:val="0"/>
+          <w:bCs w:val="0"/>
+          <w:lang w:val="es-ES"/>
+        </w:rPr>
+      </w:pPr>
+      <w:r>
+        <w:rPr>
+          <w:b w:val="0"/>
+          <w:bCs w:val="0"/>
+          <w:lang w:val="es-ES"/>
+        </w:rPr>
+        <w:t xml:space="preserve">El </w:t>
+      </w:r>
+      <w:r>
+        <w:rPr>
+          <w:b w:val="0"/>
+          <w:bCs w:val="0"/>
+          <w:highlight w:val="yellow"/>
+          <w:lang w:val="es-ES"/>
+        </w:rPr>
+        <w:t>operario</w:t>
+      </w:r>
+      <w:r>
+        <w:rPr>
+          <w:b w:val="0"/>
+          <w:bCs w:val="0"/>
+          <w:lang w:val="es-ES"/>
+        </w:rPr>
+        <w:t xml:space="preserve"> puede </w:t>
+      </w:r>
+      <w:r>
+        <w:rPr>
+          <w:b w:val="0"/>
+          <w:bCs w:val="0"/>
+          <w:highlight w:val="magenta"/>
+          <w:lang w:val="es-ES"/>
+        </w:rPr>
+        <w:t xml:space="preserve">extraer </w:t>
+      </w:r>
+      <w:r>
+        <w:rPr>
+          <w:b w:val="0"/>
+          <w:bCs w:val="0"/>
+          <w:lang w:val="es-ES"/>
+        </w:rPr>
+        <w:t xml:space="preserve">un </w:t>
+      </w:r>
+      <w:r>
+        <w:rPr>
+          <w:b w:val="0"/>
+          <w:bCs w:val="0"/>
+          <w:highlight w:val="darkGray"/>
+          <w:lang w:val="es-ES"/>
+        </w:rPr>
+        <w:t>reporte</w:t>
+      </w:r>
+      <w:r>
+        <w:rPr>
+          <w:b w:val="0"/>
+          <w:bCs w:val="0"/>
           <w:lang w:val="es-ES"/>
         </w:rPr>
         <w:t xml:space="preserve"> de existencias según corresponda.</w:t>
@@ -2688,30 +3305,41 @@
           <w:numId w:val="9"/>
         </w:numPr>
         <w:rPr>
-          <w:lang w:val="es-ES"/>
-        </w:rPr>
-      </w:pPr>
-      <w:r>
-        <w:rPr>
-          <w:lang w:val="es-ES"/>
-        </w:rPr>
-        <w:t xml:space="preserve">El </w:t>
-      </w:r>
-      <w:r>
-        <w:rPr>
-          <w:highlight w:val="green"/>
-          <w:lang w:val="es-ES"/>
-        </w:rPr>
-        <w:t>cliente llama o envía un mensaje para reservar</w:t>
-      </w:r>
-      <w:r>
-        <w:rPr>
-          <w:lang w:val="es-ES"/>
-        </w:rPr>
-        <w:t xml:space="preserve"> un turno de atención, preguntando </w:t>
-      </w:r>
-      <w:r>
-        <w:rPr>
+          <w:b w:val="0"/>
+          <w:bCs w:val="0"/>
+          <w:lang w:val="es-ES"/>
+        </w:rPr>
+      </w:pPr>
+      <w:r>
+        <w:rPr>
+          <w:b w:val="0"/>
+          <w:bCs w:val="0"/>
+          <w:lang w:val="es-ES"/>
+        </w:rPr>
+        <w:lastRenderedPageBreak/>
+        <w:t xml:space="preserve">El cliente llama o envía un mensaje para reservar un </w:t>
+      </w:r>
+      <w:r>
+        <w:rPr>
+          <w:b w:val="0"/>
+          <w:bCs w:val="0"/>
+          <w:highlight w:val="darkGray"/>
+          <w:lang w:val="es-ES"/>
+        </w:rPr>
+        <w:t xml:space="preserve">turno </w:t>
+      </w:r>
+      <w:r>
+        <w:rPr>
+          <w:b w:val="0"/>
+          <w:bCs w:val="0"/>
+          <w:lang w:val="es-ES"/>
+        </w:rPr>
+        <w:t xml:space="preserve">de atención, preguntando </w:t>
+      </w:r>
+      <w:r>
+        <w:rPr>
+          <w:b w:val="0"/>
+          <w:bCs w:val="0"/>
           <w:highlight w:val="cyan"/>
           <w:lang w:val="es-ES"/>
         </w:rPr>
@@ -2726,17 +3354,23 @@
           <w:numId w:val="9"/>
         </w:numPr>
         <w:rPr>
-          <w:lang w:val="es-ES"/>
-        </w:rPr>
-      </w:pPr>
-      <w:r>
-        <w:rPr>
+          <w:b w:val="0"/>
+          <w:bCs w:val="0"/>
+          <w:lang w:val="es-ES"/>
+        </w:rPr>
+      </w:pPr>
+      <w:r>
+        <w:rPr>
+          <w:b w:val="0"/>
+          <w:bCs w:val="0"/>
           <w:lang w:val="es-ES"/>
         </w:rPr>
         <w:t xml:space="preserve">El recepcionista </w:t>
       </w:r>
       <w:r>
         <w:rPr>
+          <w:b w:val="0"/>
+          <w:bCs w:val="0"/>
           <w:highlight w:val="green"/>
           <w:lang w:val="es-ES"/>
         </w:rPr>
@@ -2744,12 +3378,16 @@
       </w:r>
       <w:r>
         <w:rPr>
+          <w:b w:val="0"/>
+          <w:bCs w:val="0"/>
           <w:lang w:val="es-ES"/>
         </w:rPr>
         <w:t xml:space="preserve"> del cliente y buscará en la agenda </w:t>
       </w:r>
       <w:r>
         <w:rPr>
+          <w:b w:val="0"/>
+          <w:bCs w:val="0"/>
           <w:highlight w:val="magenta"/>
           <w:lang w:val="es-ES"/>
         </w:rPr>
@@ -2764,17 +3402,40 @@
           <w:numId w:val="9"/>
         </w:numPr>
         <w:rPr>
-          <w:lang w:val="es-ES"/>
-        </w:rPr>
-      </w:pPr>
-      <w:r>
-        <w:rPr>
-          <w:lang w:val="es-ES"/>
-        </w:rPr>
-        <w:t xml:space="preserve">El cliente da el ok al turno con </w:t>
-      </w:r>
-      <w:r>
-        <w:rPr>
+          <w:b w:val="0"/>
+          <w:bCs w:val="0"/>
+          <w:lang w:val="es-ES"/>
+        </w:rPr>
+      </w:pPr>
+      <w:r>
+        <w:rPr>
+          <w:b w:val="0"/>
+          <w:bCs w:val="0"/>
+          <w:lang w:val="es-ES"/>
+        </w:rPr>
+        <w:t xml:space="preserve">El cliente da el ok al </w:t>
+      </w:r>
+      <w:r>
+        <w:rPr>
+          <w:b w:val="0"/>
+          <w:bCs w:val="0"/>
+          <w:highlight w:val="darkGray"/>
+          <w:lang w:val="es-ES"/>
+        </w:rPr>
+        <w:t>turno</w:t>
+      </w:r>
+      <w:r>
+        <w:rPr>
+          <w:b w:val="0"/>
+          <w:bCs w:val="0"/>
+          <w:lang w:val="es-ES"/>
+        </w:rPr>
+        <w:t xml:space="preserve"> con </w:t>
+      </w:r>
+      <w:r>
+        <w:rPr>
+          <w:b w:val="0"/>
+          <w:bCs w:val="0"/>
           <w:highlight w:val="cyan"/>
           <w:lang w:val="es-ES"/>
         </w:rPr>
@@ -2782,6 +3443,8 @@
       </w:r>
       <w:r>
         <w:rPr>
+          <w:b w:val="0"/>
+          <w:bCs w:val="0"/>
           <w:lang w:val="es-ES"/>
         </w:rPr>
         <w:t xml:space="preserve"> y se realiza el alta del turno en el sistema.</w:t>
@@ -2803,17 +3466,57 @@
           <w:numId w:val="10"/>
         </w:numPr>
         <w:rPr>
-          <w:lang w:val="es-ES"/>
-        </w:rPr>
-      </w:pPr>
-      <w:r>
-        <w:rPr>
-          <w:lang w:val="es-ES"/>
-        </w:rPr>
-        <w:t xml:space="preserve">El gerente abre el módulo de reportes y </w:t>
-      </w:r>
-      <w:r>
-        <w:rPr>
+          <w:b w:val="0"/>
+          <w:bCs w:val="0"/>
+          <w:lang w:val="es-ES"/>
+        </w:rPr>
+      </w:pPr>
+      <w:r>
+        <w:rPr>
+          <w:b w:val="0"/>
+          <w:bCs w:val="0"/>
+          <w:lang w:val="es-ES"/>
+        </w:rPr>
+        <w:t xml:space="preserve">El </w:t>
+      </w:r>
+      <w:r>
+        <w:rPr>
+          <w:b w:val="0"/>
+          <w:bCs w:val="0"/>
+          <w:highlight w:val="darkGray"/>
+          <w:lang w:val="es-ES"/>
+        </w:rPr>
+        <w:t>gerente</w:t>
+      </w:r>
+      <w:r>
+        <w:rPr>
+          <w:b w:val="0"/>
+          <w:bCs w:val="0"/>
+          <w:lang w:val="es-ES"/>
+        </w:rPr>
+        <w:t xml:space="preserve"> abre el módulo de </w:t>
+      </w:r>
+      <w:r>
+        <w:rPr>
+          <w:b w:val="0"/>
+          <w:bCs w:val="0"/>
+          <w:highlight w:val="darkGray"/>
+          <w:lang w:val="es-ES"/>
+        </w:rPr>
+        <w:t>reportes</w:t>
+      </w:r>
+      <w:r>
+        <w:rPr>
+          <w:b w:val="0"/>
+          <w:bCs w:val="0"/>
+          <w:lang w:val="es-ES"/>
+        </w:rPr>
+        <w:t xml:space="preserve"> y </w:t>
+      </w:r>
+      <w:r>
+        <w:rPr>
+          <w:b w:val="0"/>
+          <w:bCs w:val="0"/>
           <w:highlight w:val="green"/>
           <w:lang w:val="es-ES"/>
         </w:rPr>
@@ -2821,18 +3524,24 @@
       </w:r>
       <w:r>
         <w:rPr>
+          <w:b w:val="0"/>
+          <w:bCs w:val="0"/>
           <w:lang w:val="es-ES"/>
         </w:rPr>
         <w:t xml:space="preserve"> y un producto para ver que insumos son solicitados en esa época</w:t>
       </w:r>
       <w:r>
         <w:rPr>
+          <w:b w:val="0"/>
+          <w:bCs w:val="0"/>
           <w:lang w:val="es-ES"/>
         </w:rPr>
         <w:t xml:space="preserve">, para eso elige </w:t>
       </w:r>
       <w:r>
         <w:rPr>
+          <w:b w:val="0"/>
+          <w:bCs w:val="0"/>
           <w:highlight w:val="cyan"/>
           <w:lang w:val="es-ES"/>
         </w:rPr>
@@ -2840,6 +3549,8 @@
       </w:r>
       <w:r>
         <w:rPr>
+          <w:b w:val="0"/>
+          <w:bCs w:val="0"/>
           <w:lang w:val="es-ES"/>
         </w:rPr>
         <w:t>.</w:t>
@@ -2853,27 +3564,18 @@
           <w:numId w:val="10"/>
         </w:numPr>
         <w:rPr>
-          <w:lang w:val="es-ES"/>
-        </w:rPr>
-      </w:pPr>
-      <w:r>
-        <w:rPr>
-          <w:lang w:val="es-ES"/>
-        </w:rPr>
-        <w:t xml:space="preserve">El sistema </w:t>
-      </w:r>
-      <w:r>
-        <w:rPr>
-          <w:highlight w:val="magenta"/>
-          <w:lang w:val="es-ES"/>
-        </w:rPr>
-        <w:t>muestra según este período cuales son los insumos más y menos solicitados</w:t>
-      </w:r>
-      <w:r>
-        <w:rPr>
-          <w:lang w:val="es-ES"/>
-        </w:rPr>
-        <w:t xml:space="preserve"> en la época solicitada por el gerente.</w:t>
+          <w:b w:val="0"/>
+          <w:bCs w:val="0"/>
+          <w:lang w:val="es-ES"/>
+        </w:rPr>
+      </w:pPr>
+      <w:r>
+        <w:rPr>
+          <w:b w:val="0"/>
+          <w:bCs w:val="0"/>
+          <w:lang w:val="es-ES"/>
+        </w:rPr>
+        <w:t>El sistema muestra según este período cuales son los insumos más y menos solicitados en la época solicitada por el gerente.</w:t>
       </w:r>
     </w:p>
     <w:p>
@@ -2908,11 +3610,15 @@
           <w:numId w:val="1"/>
         </w:numPr>
         <w:rPr>
-          <w:lang w:val="es-ES"/>
-        </w:rPr>
-      </w:pPr>
-      <w:r>
-        <w:rPr>
+          <w:b w:val="0"/>
+          <w:bCs w:val="0"/>
+          <w:lang w:val="es-ES"/>
+        </w:rPr>
+      </w:pPr>
+      <w:r>
+        <w:rPr>
+          <w:b w:val="0"/>
+          <w:bCs w:val="0"/>
           <w:lang w:val="es-ES"/>
         </w:rPr>
         <w:t>Integración con plataformas de comunicación: Al ser un sistema sin acceso a internet, no incluye conexión con módulos de avisos en medios, envío de e-mails o notificaciones automáticas.</w:t>
@@ -2926,14 +3632,17 @@
           <w:numId w:val="1"/>
         </w:numPr>
         <w:rPr>
-          <w:lang w:val="es-ES"/>
-        </w:rPr>
-      </w:pPr>
-      <w:r>
-        <w:rPr>
-          <w:lang w:val="es-ES"/>
-        </w:rPr>
-        <w:lastRenderedPageBreak/>
+          <w:b w:val="0"/>
+          <w:bCs w:val="0"/>
+          <w:lang w:val="es-ES"/>
+        </w:rPr>
+      </w:pPr>
+      <w:r>
+        <w:rPr>
+          <w:b w:val="0"/>
+          <w:bCs w:val="0"/>
+          <w:lang w:val="es-ES"/>
+        </w:rPr>
         <w:t>Gestión Contable Avanzada: No realiza el armado de Libro Diario ni procesos de contabilidad formal.</w:t>
       </w:r>
     </w:p>
@@ -2945,14 +3654,28 @@
           <w:numId w:val="1"/>
         </w:numPr>
         <w:rPr>
-          <w:lang w:val="es-ES"/>
-        </w:rPr>
-      </w:pPr>
-      <w:r>
-        <w:rPr>
-          <w:lang w:val="es-ES"/>
-        </w:rPr>
-        <w:t>Módulo de Cuentas a Pagar: No se incluye la gestión de deudas con proveedores ni cronogramas de pagos salientes.</w:t>
+          <w:b w:val="0"/>
+          <w:bCs w:val="0"/>
+          <w:lang w:val="es-ES"/>
+        </w:rPr>
+      </w:pPr>
+      <w:proofErr w:type="gramStart"/>
+      <w:r>
+        <w:rPr>
+          <w:b w:val="0"/>
+          <w:bCs w:val="0"/>
+          <w:lang w:val="es-ES"/>
+        </w:rPr>
+        <w:t>Módulo de Cuentas a Pagar</w:t>
+      </w:r>
+      <w:proofErr w:type="gramEnd"/>
+      <w:r>
+        <w:rPr>
+          <w:b w:val="0"/>
+          <w:bCs w:val="0"/>
+          <w:lang w:val="es-ES"/>
+        </w:rPr>
+        <w:t>: No se incluye la gestión de deudas con proveedores ni cronogramas de pagos salientes.</w:t>
       </w:r>
     </w:p>
     <w:p>
@@ -2963,14 +3686,28 @@
           <w:numId w:val="1"/>
         </w:numPr>
         <w:rPr>
-          <w:lang w:val="es-ES"/>
-        </w:rPr>
-      </w:pPr>
-      <w:r>
-        <w:rPr>
-          <w:lang w:val="es-ES"/>
-        </w:rPr>
-        <w:t>Módulo de Cuentas a Cobrar: No contempla la administración de cuentas corrientes de clientes, saldos pendientes o planes de financiación.</w:t>
+          <w:b w:val="0"/>
+          <w:bCs w:val="0"/>
+          <w:lang w:val="es-ES"/>
+        </w:rPr>
+      </w:pPr>
+      <w:proofErr w:type="gramStart"/>
+      <w:r>
+        <w:rPr>
+          <w:b w:val="0"/>
+          <w:bCs w:val="0"/>
+          <w:lang w:val="es-ES"/>
+        </w:rPr>
+        <w:t>Módulo de Cuentas a Cobrar</w:t>
+      </w:r>
+      <w:proofErr w:type="gramEnd"/>
+      <w:r>
+        <w:rPr>
+          <w:b w:val="0"/>
+          <w:bCs w:val="0"/>
+          <w:lang w:val="es-ES"/>
+        </w:rPr>
+        <w:t>: No contempla la administración de cuentas corrientes de clientes, saldos pendientes o planes de financiación.</w:t>
       </w:r>
     </w:p>
     <w:p>
@@ -2981,11 +3718,15 @@
           <w:numId w:val="1"/>
         </w:numPr>
         <w:rPr>
-          <w:lang w:val="es-ES"/>
-        </w:rPr>
-      </w:pPr>
-      <w:r>
-        <w:rPr>
+          <w:b w:val="0"/>
+          <w:bCs w:val="0"/>
+          <w:lang w:val="es-ES"/>
+        </w:rPr>
+      </w:pPr>
+      <w:r>
+        <w:rPr>
+          <w:b w:val="0"/>
+          <w:bCs w:val="0"/>
           <w:lang w:val="es-ES"/>
         </w:rPr>
         <w:t>Módulo de Compras: No automatiza la generación de órdenes de compra ni la comparativa de presupuestos con proveedores externos.</w:t>
@@ -2999,13 +3740,18 @@
           <w:numId w:val="1"/>
         </w:numPr>
         <w:rPr>
-          <w:lang w:val="es-ES"/>
-        </w:rPr>
-      </w:pPr>
-      <w:r>
-        <w:rPr>
-          <w:lang w:val="es-ES"/>
-        </w:rPr>
+          <w:b w:val="0"/>
+          <w:bCs w:val="0"/>
+          <w:lang w:val="es-ES"/>
+        </w:rPr>
+      </w:pPr>
+      <w:r>
+        <w:rPr>
+          <w:b w:val="0"/>
+          <w:bCs w:val="0"/>
+          <w:lang w:val="es-ES"/>
+        </w:rPr>
+        <w:lastRenderedPageBreak/>
         <w:t>Interfaz de Autogestión Web: No existe un portal para que los dueños de las mascotas consulten turnos o historias clínicas vía navegador.</w:t>
       </w:r>
     </w:p>
@@ -3017,15 +3763,720 @@
           <w:numId w:val="1"/>
         </w:numPr>
         <w:rPr>
-          <w:lang w:val="es-ES"/>
-        </w:rPr>
-      </w:pPr>
-      <w:r>
-        <w:rPr>
+          <w:b w:val="0"/>
+          <w:bCs w:val="0"/>
+          <w:lang w:val="es-ES"/>
+        </w:rPr>
+      </w:pPr>
+      <w:r>
+        <w:rPr>
+          <w:b w:val="0"/>
+          <w:bCs w:val="0"/>
           <w:lang w:val="es-ES"/>
         </w:rPr>
         <w:t>Sincronización de Datos en la Nube: La persistencia es estrictamente local y no admite réplicas en servidores remotos.</w:t>
       </w:r>
+    </w:p>
+    <w:p>
+      <w:pPr>
+        <w:pStyle w:val="EstiloJavi"/>
+        <w:rPr>
+          <w:b w:val="0"/>
+          <w:bCs w:val="0"/>
+          <w:lang w:val="es-ES"/>
+        </w:rPr>
+      </w:pPr>
+    </w:p>
+    <w:tbl>
+      <w:tblPr>
+        <w:tblStyle w:val="Tablaconcuadrcula"/>
+        <w:tblW w:w="0" w:type="auto"/>
+        <w:tblLayout w:type="fixed"/>
+        <w:tblLook w:val="04A0" w:firstRow="1" w:lastRow="0" w:firstColumn="1" w:lastColumn="0" w:noHBand="0" w:noVBand="1"/>
+      </w:tblPr>
+      <w:tblGrid>
+        <w:gridCol w:w="969"/>
+        <w:gridCol w:w="4838"/>
+        <w:gridCol w:w="3021"/>
+      </w:tblGrid>
+      <w:tr>
+        <w:tc>
+          <w:tcPr>
+            <w:tcW w:w="969" w:type="dxa"/>
+          </w:tcPr>
+          <w:p>
+            <w:pPr>
+              <w:pStyle w:val="EstiloJavi"/>
+              <w:pBdr>
+                <w:top w:val="none" w:sz="0" w:space="0" w:color="auto"/>
+                <w:left w:val="none" w:sz="0" w:space="0" w:color="auto"/>
+                <w:bottom w:val="none" w:sz="0" w:space="0" w:color="auto"/>
+                <w:right w:val="none" w:sz="0" w:space="0" w:color="auto"/>
+                <w:between w:val="none" w:sz="0" w:space="0" w:color="auto"/>
+              </w:pBdr>
+              <w:jc w:val="center"/>
+              <w:rPr>
+                <w:b w:val="0"/>
+                <w:bCs w:val="0"/>
+                <w:lang w:val="es-ES"/>
+              </w:rPr>
+            </w:pPr>
+            <w:r>
+              <w:rPr>
+                <w:b w:val="0"/>
+                <w:bCs w:val="0"/>
+                <w:lang w:val="es-ES"/>
+              </w:rPr>
+              <w:t>Color</w:t>
+            </w:r>
+          </w:p>
+        </w:tc>
+        <w:tc>
+          <w:tcPr>
+            <w:tcW w:w="4838" w:type="dxa"/>
+          </w:tcPr>
+          <w:p>
+            <w:pPr>
+              <w:pStyle w:val="EstiloJavi"/>
+              <w:pBdr>
+                <w:top w:val="none" w:sz="0" w:space="0" w:color="auto"/>
+                <w:left w:val="none" w:sz="0" w:space="0" w:color="auto"/>
+                <w:bottom w:val="none" w:sz="0" w:space="0" w:color="auto"/>
+                <w:right w:val="none" w:sz="0" w:space="0" w:color="auto"/>
+                <w:between w:val="none" w:sz="0" w:space="0" w:color="auto"/>
+              </w:pBdr>
+              <w:jc w:val="center"/>
+              <w:rPr>
+                <w:b w:val="0"/>
+                <w:bCs w:val="0"/>
+                <w:lang w:val="es-ES"/>
+              </w:rPr>
+            </w:pPr>
+            <w:r>
+              <w:rPr>
+                <w:b w:val="0"/>
+                <w:bCs w:val="0"/>
+                <w:lang w:val="es-ES"/>
+              </w:rPr>
+              <w:t>Acción</w:t>
+            </w:r>
+          </w:p>
+        </w:tc>
+        <w:tc>
+          <w:tcPr>
+            <w:tcW w:w="3021" w:type="dxa"/>
+          </w:tcPr>
+          <w:p>
+            <w:pPr>
+              <w:pStyle w:val="EstiloJavi"/>
+              <w:pBdr>
+                <w:top w:val="none" w:sz="0" w:space="0" w:color="auto"/>
+                <w:left w:val="none" w:sz="0" w:space="0" w:color="auto"/>
+                <w:bottom w:val="none" w:sz="0" w:space="0" w:color="auto"/>
+                <w:right w:val="none" w:sz="0" w:space="0" w:color="auto"/>
+                <w:between w:val="none" w:sz="0" w:space="0" w:color="auto"/>
+              </w:pBdr>
+              <w:jc w:val="center"/>
+              <w:rPr>
+                <w:b w:val="0"/>
+                <w:bCs w:val="0"/>
+                <w:lang w:val="es-ES"/>
+              </w:rPr>
+            </w:pPr>
+            <w:r>
+              <w:rPr>
+                <w:b w:val="0"/>
+                <w:bCs w:val="0"/>
+                <w:lang w:val="es-ES"/>
+              </w:rPr>
+              <w:t>Descripción</w:t>
+            </w:r>
+          </w:p>
+        </w:tc>
+      </w:tr>
+      <w:tr>
+        <w:tc>
+          <w:tcPr>
+            <w:tcW w:w="969" w:type="dxa"/>
+          </w:tcPr>
+          <w:p>
+            <w:pPr>
+              <w:pStyle w:val="EstiloJavi"/>
+              <w:pBdr>
+                <w:top w:val="none" w:sz="0" w:space="0" w:color="auto"/>
+                <w:left w:val="none" w:sz="0" w:space="0" w:color="auto"/>
+                <w:bottom w:val="none" w:sz="0" w:space="0" w:color="auto"/>
+                <w:right w:val="none" w:sz="0" w:space="0" w:color="auto"/>
+                <w:between w:val="none" w:sz="0" w:space="0" w:color="auto"/>
+              </w:pBdr>
+              <w:rPr>
+                <w:b w:val="0"/>
+                <w:bCs w:val="0"/>
+                <w:lang w:val="es-ES"/>
+              </w:rPr>
+            </w:pPr>
+            <w:r>
+              <w:rPr>
+                <w:b w:val="0"/>
+                <w:bCs w:val="0"/>
+                <w:highlight w:val="darkGray"/>
+                <w:lang w:val="es-ES"/>
+              </w:rPr>
+              <w:t>Gris</w:t>
+            </w:r>
+          </w:p>
+        </w:tc>
+        <w:tc>
+          <w:tcPr>
+            <w:tcW w:w="4838" w:type="dxa"/>
+          </w:tcPr>
+          <w:p>
+            <w:pPr>
+              <w:pStyle w:val="EstiloJavi"/>
+              <w:pBdr>
+                <w:top w:val="none" w:sz="0" w:space="0" w:color="auto"/>
+                <w:left w:val="none" w:sz="0" w:space="0" w:color="auto"/>
+                <w:bottom w:val="none" w:sz="0" w:space="0" w:color="auto"/>
+                <w:right w:val="none" w:sz="0" w:space="0" w:color="auto"/>
+                <w:between w:val="none" w:sz="0" w:space="0" w:color="auto"/>
+              </w:pBdr>
+              <w:rPr>
+                <w:b w:val="0"/>
+                <w:bCs w:val="0"/>
+                <w:lang w:val="es-ES"/>
+              </w:rPr>
+            </w:pPr>
+            <w:r>
+              <w:rPr>
+                <w:b w:val="0"/>
+                <w:bCs w:val="0"/>
+                <w:lang w:val="es-ES"/>
+              </w:rPr>
+              <w:t>Actor que envía o recibe informaci</w:t>
+            </w:r>
+            <w:r>
+              <w:rPr>
+                <w:b w:val="0"/>
+                <w:bCs w:val="0"/>
+                <w:lang w:val="es-ES"/>
+              </w:rPr>
+              <w:t>ón (Quien)</w:t>
+            </w:r>
+          </w:p>
+        </w:tc>
+        <w:tc>
+          <w:tcPr>
+            <w:tcW w:w="3021" w:type="dxa"/>
+          </w:tcPr>
+          <w:p>
+            <w:pPr>
+              <w:pStyle w:val="EstiloJavi"/>
+              <w:pBdr>
+                <w:top w:val="none" w:sz="0" w:space="0" w:color="auto"/>
+                <w:left w:val="none" w:sz="0" w:space="0" w:color="auto"/>
+                <w:bottom w:val="none" w:sz="0" w:space="0" w:color="auto"/>
+                <w:right w:val="none" w:sz="0" w:space="0" w:color="auto"/>
+                <w:between w:val="none" w:sz="0" w:space="0" w:color="auto"/>
+              </w:pBdr>
+              <w:jc w:val="center"/>
+              <w:rPr>
+                <w:b w:val="0"/>
+                <w:bCs w:val="0"/>
+                <w:lang w:val="es-ES"/>
+              </w:rPr>
+            </w:pPr>
+            <w:r>
+              <w:rPr>
+                <w:b w:val="0"/>
+                <w:bCs w:val="0"/>
+                <w:lang w:val="es-ES"/>
+              </w:rPr>
+              <w:t>N/A</w:t>
+            </w:r>
+          </w:p>
+        </w:tc>
+      </w:tr>
+      <w:tr>
+        <w:tc>
+          <w:tcPr>
+            <w:tcW w:w="969" w:type="dxa"/>
+          </w:tcPr>
+          <w:p>
+            <w:pPr>
+              <w:pStyle w:val="EstiloJavi"/>
+              <w:pBdr>
+                <w:top w:val="none" w:sz="0" w:space="0" w:color="auto"/>
+                <w:left w:val="none" w:sz="0" w:space="0" w:color="auto"/>
+                <w:bottom w:val="none" w:sz="0" w:space="0" w:color="auto"/>
+                <w:right w:val="none" w:sz="0" w:space="0" w:color="auto"/>
+                <w:between w:val="none" w:sz="0" w:space="0" w:color="auto"/>
+              </w:pBdr>
+              <w:rPr>
+                <w:b w:val="0"/>
+                <w:bCs w:val="0"/>
+                <w:lang w:val="es-ES"/>
+              </w:rPr>
+            </w:pPr>
+            <w:r>
+              <w:rPr>
+                <w:b w:val="0"/>
+                <w:bCs w:val="0"/>
+                <w:highlight w:val="magenta"/>
+                <w:lang w:val="es-ES"/>
+              </w:rPr>
+              <w:t>Fucsia</w:t>
+            </w:r>
+          </w:p>
+        </w:tc>
+        <w:tc>
+          <w:tcPr>
+            <w:tcW w:w="4838" w:type="dxa"/>
+          </w:tcPr>
+          <w:p>
+            <w:pPr>
+              <w:pStyle w:val="EstiloJavi"/>
+              <w:pBdr>
+                <w:top w:val="none" w:sz="0" w:space="0" w:color="auto"/>
+                <w:left w:val="none" w:sz="0" w:space="0" w:color="auto"/>
+                <w:bottom w:val="none" w:sz="0" w:space="0" w:color="auto"/>
+                <w:right w:val="none" w:sz="0" w:space="0" w:color="auto"/>
+                <w:between w:val="none" w:sz="0" w:space="0" w:color="auto"/>
+              </w:pBdr>
+              <w:rPr>
+                <w:b w:val="0"/>
+                <w:bCs w:val="0"/>
+                <w:lang w:val="es-ES"/>
+              </w:rPr>
+            </w:pPr>
+            <w:r>
+              <w:rPr>
+                <w:b w:val="0"/>
+                <w:bCs w:val="0"/>
+                <w:lang w:val="es-ES"/>
+              </w:rPr>
+              <w:t>Acción de envío de información (Que)</w:t>
+            </w:r>
+          </w:p>
+        </w:tc>
+        <w:tc>
+          <w:tcPr>
+            <w:tcW w:w="3021" w:type="dxa"/>
+          </w:tcPr>
+          <w:p>
+            <w:pPr>
+              <w:pStyle w:val="EstiloJavi"/>
+              <w:pBdr>
+                <w:top w:val="none" w:sz="0" w:space="0" w:color="auto"/>
+                <w:left w:val="none" w:sz="0" w:space="0" w:color="auto"/>
+                <w:bottom w:val="none" w:sz="0" w:space="0" w:color="auto"/>
+                <w:right w:val="none" w:sz="0" w:space="0" w:color="auto"/>
+                <w:between w:val="none" w:sz="0" w:space="0" w:color="auto"/>
+              </w:pBdr>
+              <w:jc w:val="center"/>
+              <w:rPr>
+                <w:b w:val="0"/>
+                <w:bCs w:val="0"/>
+                <w:lang w:val="es-ES"/>
+              </w:rPr>
+            </w:pPr>
+            <w:r>
+              <w:rPr>
+                <w:b w:val="0"/>
+                <w:bCs w:val="0"/>
+                <w:lang w:val="es-ES"/>
+              </w:rPr>
+              <w:t>Enviar/Entregar/Dar</w:t>
+            </w:r>
+          </w:p>
+        </w:tc>
+      </w:tr>
+      <w:tr>
+        <w:tc>
+          <w:tcPr>
+            <w:tcW w:w="969" w:type="dxa"/>
+          </w:tcPr>
+          <w:p>
+            <w:pPr>
+              <w:pStyle w:val="EstiloJavi"/>
+              <w:pBdr>
+                <w:top w:val="none" w:sz="0" w:space="0" w:color="auto"/>
+                <w:left w:val="none" w:sz="0" w:space="0" w:color="auto"/>
+                <w:bottom w:val="none" w:sz="0" w:space="0" w:color="auto"/>
+                <w:right w:val="none" w:sz="0" w:space="0" w:color="auto"/>
+                <w:between w:val="none" w:sz="0" w:space="0" w:color="auto"/>
+              </w:pBdr>
+              <w:rPr>
+                <w:b w:val="0"/>
+                <w:bCs w:val="0"/>
+                <w:highlight w:val="magenta"/>
+                <w:lang w:val="es-ES"/>
+              </w:rPr>
+            </w:pPr>
+            <w:r>
+              <w:rPr>
+                <w:b w:val="0"/>
+                <w:bCs w:val="0"/>
+                <w:highlight w:val="yellow"/>
+                <w:lang w:val="es-ES"/>
+              </w:rPr>
+              <w:t>Amarillo</w:t>
+            </w:r>
+          </w:p>
+        </w:tc>
+        <w:tc>
+          <w:tcPr>
+            <w:tcW w:w="4838" w:type="dxa"/>
+          </w:tcPr>
+          <w:p>
+            <w:pPr>
+              <w:pStyle w:val="EstiloJavi"/>
+              <w:pBdr>
+                <w:top w:val="none" w:sz="0" w:space="0" w:color="auto"/>
+                <w:left w:val="none" w:sz="0" w:space="0" w:color="auto"/>
+                <w:bottom w:val="none" w:sz="0" w:space="0" w:color="auto"/>
+                <w:right w:val="none" w:sz="0" w:space="0" w:color="auto"/>
+                <w:between w:val="none" w:sz="0" w:space="0" w:color="auto"/>
+              </w:pBdr>
+              <w:rPr>
+                <w:b w:val="0"/>
+                <w:bCs w:val="0"/>
+                <w:lang w:val="es-ES"/>
+              </w:rPr>
+            </w:pPr>
+            <w:r>
+              <w:rPr>
+                <w:b w:val="0"/>
+                <w:bCs w:val="0"/>
+                <w:lang w:val="es-ES"/>
+              </w:rPr>
+              <w:t>Actor que procesa información (Quien)</w:t>
+            </w:r>
+          </w:p>
+        </w:tc>
+        <w:tc>
+          <w:tcPr>
+            <w:tcW w:w="3021" w:type="dxa"/>
+          </w:tcPr>
+          <w:p>
+            <w:pPr>
+              <w:pStyle w:val="EstiloJavi"/>
+              <w:pBdr>
+                <w:top w:val="none" w:sz="0" w:space="0" w:color="auto"/>
+                <w:left w:val="none" w:sz="0" w:space="0" w:color="auto"/>
+                <w:bottom w:val="none" w:sz="0" w:space="0" w:color="auto"/>
+                <w:right w:val="none" w:sz="0" w:space="0" w:color="auto"/>
+                <w:between w:val="none" w:sz="0" w:space="0" w:color="auto"/>
+              </w:pBdr>
+              <w:jc w:val="center"/>
+              <w:rPr>
+                <w:b w:val="0"/>
+                <w:bCs w:val="0"/>
+                <w:lang w:val="es-ES"/>
+              </w:rPr>
+            </w:pPr>
+            <w:r>
+              <w:rPr>
+                <w:b w:val="0"/>
+                <w:bCs w:val="0"/>
+                <w:lang w:val="es-ES"/>
+              </w:rPr>
+              <w:t>N/A</w:t>
+            </w:r>
+          </w:p>
+        </w:tc>
+      </w:tr>
+      <w:tr>
+        <w:tc>
+          <w:tcPr>
+            <w:tcW w:w="969" w:type="dxa"/>
+          </w:tcPr>
+          <w:p>
+            <w:pPr>
+              <w:pStyle w:val="EstiloJavi"/>
+              <w:pBdr>
+                <w:top w:val="none" w:sz="0" w:space="0" w:color="auto"/>
+                <w:left w:val="none" w:sz="0" w:space="0" w:color="auto"/>
+                <w:bottom w:val="none" w:sz="0" w:space="0" w:color="auto"/>
+                <w:right w:val="none" w:sz="0" w:space="0" w:color="auto"/>
+                <w:between w:val="none" w:sz="0" w:space="0" w:color="auto"/>
+              </w:pBdr>
+              <w:rPr>
+                <w:b w:val="0"/>
+                <w:bCs w:val="0"/>
+                <w:lang w:val="es-ES"/>
+              </w:rPr>
+            </w:pPr>
+            <w:r>
+              <w:rPr>
+                <w:b w:val="0"/>
+                <w:bCs w:val="0"/>
+                <w:highlight w:val="green"/>
+                <w:lang w:val="es-ES"/>
+              </w:rPr>
+              <w:t>Verde</w:t>
+            </w:r>
+          </w:p>
+        </w:tc>
+        <w:tc>
+          <w:tcPr>
+            <w:tcW w:w="4838" w:type="dxa"/>
+          </w:tcPr>
+          <w:p>
+            <w:pPr>
+              <w:pStyle w:val="EstiloJavi"/>
+              <w:pBdr>
+                <w:top w:val="none" w:sz="0" w:space="0" w:color="auto"/>
+                <w:left w:val="none" w:sz="0" w:space="0" w:color="auto"/>
+                <w:bottom w:val="none" w:sz="0" w:space="0" w:color="auto"/>
+                <w:right w:val="none" w:sz="0" w:space="0" w:color="auto"/>
+                <w:between w:val="none" w:sz="0" w:space="0" w:color="auto"/>
+              </w:pBdr>
+              <w:rPr>
+                <w:b w:val="0"/>
+                <w:bCs w:val="0"/>
+                <w:lang w:val="es-ES"/>
+              </w:rPr>
+            </w:pPr>
+            <w:r>
+              <w:rPr>
+                <w:b w:val="0"/>
+                <w:bCs w:val="0"/>
+                <w:lang w:val="es-ES"/>
+              </w:rPr>
+              <w:t>Acción de procesamiento de información (Que)</w:t>
+            </w:r>
+          </w:p>
+        </w:tc>
+        <w:tc>
+          <w:tcPr>
+            <w:tcW w:w="3021" w:type="dxa"/>
+          </w:tcPr>
+          <w:p>
+            <w:pPr>
+              <w:pStyle w:val="EstiloJavi"/>
+              <w:pBdr>
+                <w:top w:val="none" w:sz="0" w:space="0" w:color="auto"/>
+                <w:left w:val="none" w:sz="0" w:space="0" w:color="auto"/>
+                <w:bottom w:val="none" w:sz="0" w:space="0" w:color="auto"/>
+                <w:right w:val="none" w:sz="0" w:space="0" w:color="auto"/>
+                <w:between w:val="none" w:sz="0" w:space="0" w:color="auto"/>
+              </w:pBdr>
+              <w:jc w:val="center"/>
+              <w:rPr>
+                <w:b w:val="0"/>
+                <w:bCs w:val="0"/>
+                <w:lang w:val="es-ES"/>
+              </w:rPr>
+            </w:pPr>
+            <w:r>
+              <w:rPr>
+                <w:b w:val="0"/>
+                <w:bCs w:val="0"/>
+                <w:lang w:val="es-ES"/>
+              </w:rPr>
+              <w:t>Seleccionar/Registrar/Calcular/Llenar/Actualizar/Generar/etc.</w:t>
+            </w:r>
+          </w:p>
+        </w:tc>
+      </w:tr>
+      <w:tr>
+        <w:tc>
+          <w:tcPr>
+            <w:tcW w:w="969" w:type="dxa"/>
+          </w:tcPr>
+          <w:p>
+            <w:pPr>
+              <w:pStyle w:val="EstiloJavi"/>
+              <w:pBdr>
+                <w:top w:val="none" w:sz="0" w:space="0" w:color="auto"/>
+                <w:left w:val="none" w:sz="0" w:space="0" w:color="auto"/>
+                <w:bottom w:val="none" w:sz="0" w:space="0" w:color="auto"/>
+                <w:right w:val="none" w:sz="0" w:space="0" w:color="auto"/>
+                <w:between w:val="none" w:sz="0" w:space="0" w:color="auto"/>
+              </w:pBdr>
+              <w:rPr>
+                <w:b w:val="0"/>
+                <w:bCs w:val="0"/>
+                <w:lang w:val="es-ES"/>
+              </w:rPr>
+            </w:pPr>
+            <w:r>
+              <w:rPr>
+                <w:b w:val="0"/>
+                <w:bCs w:val="0"/>
+                <w:highlight w:val="cyan"/>
+                <w:lang w:val="es-ES"/>
+              </w:rPr>
+              <w:t>Azul</w:t>
+            </w:r>
+          </w:p>
+        </w:tc>
+        <w:tc>
+          <w:tcPr>
+            <w:tcW w:w="4838" w:type="dxa"/>
+          </w:tcPr>
+          <w:p>
+            <w:pPr>
+              <w:pStyle w:val="EstiloJavi"/>
+              <w:pBdr>
+                <w:top w:val="none" w:sz="0" w:space="0" w:color="auto"/>
+                <w:left w:val="none" w:sz="0" w:space="0" w:color="auto"/>
+                <w:bottom w:val="none" w:sz="0" w:space="0" w:color="auto"/>
+                <w:right w:val="none" w:sz="0" w:space="0" w:color="auto"/>
+                <w:between w:val="none" w:sz="0" w:space="0" w:color="auto"/>
+              </w:pBdr>
+              <w:rPr>
+                <w:b w:val="0"/>
+                <w:bCs w:val="0"/>
+                <w:lang w:val="es-ES"/>
+              </w:rPr>
+            </w:pPr>
+            <w:r>
+              <w:rPr>
+                <w:b w:val="0"/>
+                <w:bCs w:val="0"/>
+                <w:lang w:val="es-ES"/>
+              </w:rPr>
+              <w:t>Conjunto de datos involucrados (Datos)</w:t>
+            </w:r>
+          </w:p>
+        </w:tc>
+        <w:tc>
+          <w:tcPr>
+            <w:tcW w:w="3021" w:type="dxa"/>
+          </w:tcPr>
+          <w:p>
+            <w:pPr>
+              <w:pStyle w:val="EstiloJavi"/>
+              <w:pBdr>
+                <w:top w:val="none" w:sz="0" w:space="0" w:color="auto"/>
+                <w:left w:val="none" w:sz="0" w:space="0" w:color="auto"/>
+                <w:bottom w:val="none" w:sz="0" w:space="0" w:color="auto"/>
+                <w:right w:val="none" w:sz="0" w:space="0" w:color="auto"/>
+                <w:between w:val="none" w:sz="0" w:space="0" w:color="auto"/>
+              </w:pBdr>
+              <w:jc w:val="center"/>
+              <w:rPr>
+                <w:b w:val="0"/>
+                <w:bCs w:val="0"/>
+                <w:lang w:val="es-ES"/>
+              </w:rPr>
+            </w:pPr>
+            <w:r>
+              <w:rPr>
+                <w:b w:val="0"/>
+                <w:bCs w:val="0"/>
+                <w:lang w:val="es-ES"/>
+              </w:rPr>
+              <w:t>Se pueden agrupar</w:t>
+            </w:r>
+          </w:p>
+        </w:tc>
+      </w:tr>
+      <w:tr>
+        <w:tc>
+          <w:tcPr>
+            <w:tcW w:w="969" w:type="dxa"/>
+          </w:tcPr>
+          <w:p>
+            <w:pPr>
+              <w:pStyle w:val="EstiloJavi"/>
+              <w:pBdr>
+                <w:top w:val="none" w:sz="0" w:space="0" w:color="auto"/>
+                <w:left w:val="none" w:sz="0" w:space="0" w:color="auto"/>
+                <w:bottom w:val="none" w:sz="0" w:space="0" w:color="auto"/>
+                <w:right w:val="none" w:sz="0" w:space="0" w:color="auto"/>
+                <w:between w:val="none" w:sz="0" w:space="0" w:color="auto"/>
+              </w:pBdr>
+              <w:rPr>
+                <w:b w:val="0"/>
+                <w:bCs w:val="0"/>
+                <w:lang w:val="es-ES"/>
+              </w:rPr>
+            </w:pPr>
+            <w:r>
+              <w:rPr>
+                <w:b w:val="0"/>
+                <w:bCs w:val="0"/>
+                <w:highlight w:val="red"/>
+                <w:lang w:val="es-ES"/>
+              </w:rPr>
+              <w:t>Rojo</w:t>
+            </w:r>
+          </w:p>
+        </w:tc>
+        <w:tc>
+          <w:tcPr>
+            <w:tcW w:w="4838" w:type="dxa"/>
+          </w:tcPr>
+          <w:p>
+            <w:pPr>
+              <w:pStyle w:val="EstiloJavi"/>
+              <w:pBdr>
+                <w:top w:val="none" w:sz="0" w:space="0" w:color="auto"/>
+                <w:left w:val="none" w:sz="0" w:space="0" w:color="auto"/>
+                <w:bottom w:val="none" w:sz="0" w:space="0" w:color="auto"/>
+                <w:right w:val="none" w:sz="0" w:space="0" w:color="auto"/>
+                <w:between w:val="none" w:sz="0" w:space="0" w:color="auto"/>
+              </w:pBdr>
+              <w:rPr>
+                <w:b w:val="0"/>
+                <w:bCs w:val="0"/>
+                <w:lang w:val="es-ES"/>
+              </w:rPr>
+            </w:pPr>
+            <w:r>
+              <w:rPr>
+                <w:b w:val="0"/>
+                <w:bCs w:val="0"/>
+                <w:lang w:val="es-ES"/>
+              </w:rPr>
+              <w:t>Caso decisional. Bifurcación del camino (Si)</w:t>
+            </w:r>
+          </w:p>
+        </w:tc>
+        <w:tc>
+          <w:tcPr>
+            <w:tcW w:w="3021" w:type="dxa"/>
+          </w:tcPr>
+          <w:p>
+            <w:pPr>
+              <w:pStyle w:val="EstiloJavi"/>
+              <w:pBdr>
+                <w:top w:val="none" w:sz="0" w:space="0" w:color="auto"/>
+                <w:left w:val="none" w:sz="0" w:space="0" w:color="auto"/>
+                <w:bottom w:val="none" w:sz="0" w:space="0" w:color="auto"/>
+                <w:right w:val="none" w:sz="0" w:space="0" w:color="auto"/>
+                <w:between w:val="none" w:sz="0" w:space="0" w:color="auto"/>
+              </w:pBdr>
+              <w:jc w:val="center"/>
+              <w:rPr>
+                <w:b w:val="0"/>
+                <w:bCs w:val="0"/>
+                <w:lang w:val="es-ES"/>
+              </w:rPr>
+            </w:pPr>
+            <w:r>
+              <w:rPr>
+                <w:b w:val="0"/>
+                <w:bCs w:val="0"/>
+                <w:lang w:val="es-ES"/>
+              </w:rPr>
+              <w:t>Si… Entonces…</w:t>
+            </w:r>
+          </w:p>
+        </w:tc>
+      </w:tr>
+    </w:tbl>
+    <w:p>
+      <w:pPr>
+        <w:pStyle w:val="EstiloJavi"/>
+        <w:rPr>
+          <w:b w:val="0"/>
+          <w:bCs w:val="0"/>
+          <w:lang w:val="es-ES"/>
+        </w:rPr>
+      </w:pPr>
     </w:p>
     <w:p>
       <w:pPr>
@@ -5059,7 +6510,7 @@
           <w:lang w:val="es-ES"/>
         </w:rPr>
         <w:pict w14:anchorId="1C18EDC6">
-          <v:rect id="_x0000_i1197" style="width:0;height:1.5pt" o:hralign="center" o:hrstd="t" o:hr="t" fillcolor="#a0a0a0" stroked="f"/>
+          <v:rect id="_x0000_i1049" style="width:0;height:1.5pt" o:hralign="center" o:hrstd="t" o:hr="t" fillcolor="#a0a0a0" stroked="f"/>
         </w:pict>
       </w:r>
     </w:p>
@@ -5322,7 +6773,7 @@
           <w:lang w:val="es-ES"/>
         </w:rPr>
         <w:pict w14:anchorId="0366817A">
-          <v:rect id="_x0000_i1198" style="width:0;height:1.5pt" o:hralign="center" o:hrstd="t" o:hr="t" fillcolor="#a0a0a0" stroked="f"/>
+          <v:rect id="_x0000_i1050" style="width:0;height:1.5pt" o:hralign="center" o:hrstd="t" o:hr="t" fillcolor="#a0a0a0" stroked="f"/>
         </w:pict>
       </w:r>
     </w:p>
@@ -6351,7 +7802,7 @@
           <w:bdr w:val="none" w:sz="0" w:space="0" w:color="auto" w:frame="1"/>
         </w:rPr>
         <w:drawing>
-          <wp:inline distT="0" distB="0" distL="0" distR="0" wp14:anchorId="2E91835F" wp14:editId="7001D1BB">
+          <wp:inline distT="0" distB="0" distL="0" distR="0" wp14:anchorId="2E91835F" wp14:editId="02BD064D">
             <wp:extent cx="5612130" cy="2063750"/>
             <wp:effectExtent l="0" t="0" r="7620" b="0"/>
             <wp:docPr id="170667652" name="Imagen 5" descr="C:\Users\Mario\AppData\Local\Microsoft\Windows\INetCache\Content.MSO\B7B4A2FC.tmp"/>
@@ -9223,23 +10674,7 @@
                 <w:b w:val="0"/>
                 <w:bCs w:val="0"/>
               </w:rPr>
-              <w:t xml:space="preserve">1.2. Los datos de ingresados de </w:t>
-            </w:r>
-            <w:proofErr w:type="spellStart"/>
-            <w:r>
-              <w:rPr>
-                <w:b w:val="0"/>
-                <w:bCs w:val="0"/>
-              </w:rPr>
-              <w:t>login</w:t>
-            </w:r>
-            <w:proofErr w:type="spellEnd"/>
-            <w:r>
-              <w:rPr>
-                <w:b w:val="0"/>
-                <w:bCs w:val="0"/>
-              </w:rPr>
-              <w:t xml:space="preserve"> (</w:t>
+              <w:t>1.2. Los datos de ingresados de login (</w:t>
             </w:r>
             <w:proofErr w:type="spellStart"/>
             <w:r>
@@ -9450,7 +10885,7 @@
         </w:rPr>
         <w:lastRenderedPageBreak/>
         <w:drawing>
-          <wp:inline distT="0" distB="0" distL="0" distR="0" wp14:anchorId="137D65DB" wp14:editId="30EFEF53">
+          <wp:inline distT="0" distB="0" distL="0" distR="0" wp14:anchorId="137D65DB" wp14:editId="4B7FD938">
             <wp:extent cx="5612130" cy="3338830"/>
             <wp:effectExtent l="0" t="0" r="7620" b="0"/>
             <wp:docPr id="1228977859" name="Imagen 12" descr="C:\Users\Mario\AppData\Local\Microsoft\Windows\INetCache\Content.MSO\6A059189.tmp"/>
@@ -9502,19 +10937,32 @@
     <w:p>
       <w:pPr>
         <w:pStyle w:val="Estilo2"/>
-      </w:pPr>
-      <w:r>
+        <w:rPr>
+          <w:lang w:val="fr-FR"/>
+        </w:rPr>
+      </w:pPr>
+      <w:r>
+        <w:rPr>
+          <w:lang w:val="fr-FR"/>
+        </w:rPr>
         <w:t>T02.2.6 DER</w:t>
       </w:r>
     </w:p>
     <w:p>
       <w:pPr>
         <w:pStyle w:val="Estilo2"/>
+        <w:rPr>
+          <w:lang w:val="fr-FR"/>
+        </w:rPr>
       </w:pPr>
     </w:p>
     <w:p>
       <w:pPr>
         <w:pStyle w:val="Estilo2"/>
+        <w:ind w:left="720" w:hanging="720"/>
+        <w:rPr>
+          <w:lang w:val="fr-FR"/>
+        </w:rPr>
       </w:pPr>
       <w:r>
         <w:rPr>
@@ -9577,8 +11025,14 @@
     <w:p>
       <w:pPr>
         <w:pStyle w:val="Estilo2"/>
-      </w:pPr>
-      <w:r>
+        <w:rPr>
+          <w:lang w:val="fr-FR"/>
+        </w:rPr>
+      </w:pPr>
+      <w:r>
+        <w:rPr>
+          <w:lang w:val="fr-FR"/>
+        </w:rPr>
         <w:lastRenderedPageBreak/>
         <w:t>T02.2.7 GUI</w:t>
       </w:r>
@@ -9791,7 +11245,21 @@
         <w:rPr>
           <w:lang w:val="es-ES"/>
         </w:rPr>
-        <w:t xml:space="preserve">El sistema persiste el registro en la base de datos a través de la capa de acceso a datos  mediante la función </w:t>
+        <w:t xml:space="preserve">El sistema persiste el registro en la base de datos a través de la capa de acceso a </w:t>
+      </w:r>
+      <w:proofErr w:type="gramStart"/>
+      <w:r>
+        <w:rPr>
+          <w:lang w:val="es-ES"/>
+        </w:rPr>
+        <w:t>datos  mediante</w:t>
+      </w:r>
+      <w:proofErr w:type="gramEnd"/>
+      <w:r>
+        <w:rPr>
+          <w:lang w:val="es-ES"/>
+        </w:rPr>
+        <w:t xml:space="preserve"> la función </w:t>
       </w:r>
       <w:proofErr w:type="spellStart"/>
       <w:r>
@@ -10737,7 +12205,23 @@
                 <w:b/>
                 <w:bCs/>
               </w:rPr>
-              <w:t>5. El sistema resetea la contraseña y se la envía al usuario vía email</w:t>
+              <w:t xml:space="preserve">5. El sistema </w:t>
+            </w:r>
+            <w:proofErr w:type="gramStart"/>
+            <w:r>
+              <w:rPr>
+                <w:b/>
+                <w:bCs/>
+              </w:rPr>
+              <w:t>resetea</w:t>
+            </w:r>
+            <w:proofErr w:type="gramEnd"/>
+            <w:r>
+              <w:rPr>
+                <w:b/>
+                <w:bCs/>
+              </w:rPr>
+              <w:t xml:space="preserve"> la contraseña y se la envía al usuario vía email</w:t>
             </w:r>
             <w:r>
               <w:rPr>
@@ -10948,7 +12432,7 @@
         </w:rPr>
         <w:lastRenderedPageBreak/>
         <w:drawing>
-          <wp:inline distT="0" distB="0" distL="0" distR="0" wp14:anchorId="59E21A5D" wp14:editId="75689FC2">
+          <wp:inline distT="0" distB="0" distL="0" distR="0" wp14:anchorId="59E21A5D" wp14:editId="6473DA05">
             <wp:extent cx="5612130" cy="3397250"/>
             <wp:effectExtent l="0" t="0" r="7620" b="0"/>
             <wp:docPr id="682975521" name="Imagen 17" descr="C:\Users\Mario\AppData\Local\Microsoft\Windows\INetCache\Content.MSO\73191EE5.tmp"/>
@@ -14614,6 +16098,7 @@
         <w:rPr>
           <w:rFonts w:cs="Arial"/>
           <w:b/>
+          <w:noProof/>
           <w:lang w:val="es-ES"/>
         </w:rPr>
         <w:lastRenderedPageBreak/>
@@ -15718,6 +17203,9 @@
         <w:pStyle w:val="Estilo2"/>
       </w:pPr>
       <w:r>
+        <w:rPr>
+          <w:noProof/>
+        </w:rPr>
         <w:lastRenderedPageBreak/>
         <w:drawing>
           <wp:inline distT="0" distB="0" distL="0" distR="0" wp14:anchorId="67CEAD17" wp14:editId="4482C8B4">
@@ -18755,6 +20243,7 @@
   <w:style w:type="character" w:default="1" w:styleId="Fuentedeprrafopredeter">
     <w:name w:val="Default Paragraph Font"/>
     <w:uiPriority w:val="1"/>
+    <w:semiHidden/>
     <w:unhideWhenUsed/>
   </w:style>
   <w:style w:type="table" w:default="1" w:styleId="Tablanormal">

</xml_diff>